<commit_message>
Update Word booklet formatting
</commit_message>
<xml_diff>
--- a/data/raw/community_center_booklet.docx
+++ b/data/raw/community_center_booklet.docx
@@ -74,6 +74,7 @@
           <w:rFonts w:ascii="David" w:hAnsi="David" w:cs="David"/>
           <w:sz w:val="24"/>
           <w:szCs w:val="24"/>
+          <w:lang w:bidi="he-IL"/>
         </w:rPr>
         <w:t>.</w:t>
       </w:r>
@@ -387,6 +388,7 @@
           <w:rtl/>
           <w:lang w:bidi="he-IL"/>
         </w:rPr>
+        <w:lastRenderedPageBreak/>
         <w:t>חוגים שבועיים לפי קטגוריה</w:t>
       </w:r>
     </w:p>
@@ -515,7 +517,87 @@
           <w:rtl/>
           <w:lang w:bidi="he-IL"/>
         </w:rPr>
-        <w:t>חוג 'חוג דרמה לילדים' מיועד לקבוצת גיל ילדים (גילאי 8–12). המפגשים מתקיימים ביום רביעי בשעות 17:45–18:45, באולם מופעים. מחיר חודשי: 200 ₪. מדריך/ה: מיכל לוי</w:t>
+        <w:t xml:space="preserve">חוג 'חוג דרמה לילדים' מיועד לקבוצת גיל ילדים (גילאי </w:t>
+      </w:r>
+      <w:r>
+        <w:rPr>
+          <w:rFonts w:ascii="David" w:hAnsi="David" w:hint="cs"/>
+          <w:sz w:val="24"/>
+          <w:szCs w:val="24"/>
+          <w:rtl/>
+          <w:lang w:bidi="ar-EG"/>
+        </w:rPr>
+        <w:t>12</w:t>
+      </w:r>
+      <w:r>
+        <w:rPr>
+          <w:rFonts w:ascii="David" w:hAnsi="David" w:cs="David"/>
+          <w:sz w:val="24"/>
+          <w:szCs w:val="24"/>
+          <w:rtl/>
+          <w:lang w:bidi="he-IL"/>
+        </w:rPr>
+        <w:t>–</w:t>
+      </w:r>
+      <w:r>
+        <w:rPr>
+          <w:rFonts w:ascii="David" w:hAnsi="David" w:hint="cs"/>
+          <w:sz w:val="24"/>
+          <w:szCs w:val="24"/>
+          <w:rtl/>
+          <w:lang w:bidi="ar-EG"/>
+        </w:rPr>
+        <w:t>8</w:t>
+      </w:r>
+      <w:r>
+        <w:rPr>
+          <w:rFonts w:ascii="David" w:hAnsi="David" w:cs="David"/>
+          <w:sz w:val="24"/>
+          <w:szCs w:val="24"/>
+          <w:rtl/>
+          <w:lang w:bidi="he-IL"/>
+        </w:rPr>
+        <w:t xml:space="preserve">). המפגשים מתקיימים ביום רביעי בשעות </w:t>
+      </w:r>
+      <w:r>
+        <w:rPr>
+          <w:rFonts w:ascii="David" w:hAnsi="David" w:hint="cs"/>
+          <w:sz w:val="24"/>
+          <w:szCs w:val="24"/>
+          <w:rtl/>
+          <w:lang w:bidi="ar-EG"/>
+        </w:rPr>
+        <w:t>18:45</w:t>
+      </w:r>
+      <w:r>
+        <w:rPr>
+          <w:rFonts w:ascii="David" w:hAnsi="David" w:cs="David"/>
+          <w:sz w:val="24"/>
+          <w:szCs w:val="24"/>
+          <w:rtl/>
+          <w:lang w:bidi="he-IL"/>
+        </w:rPr>
+        <w:t>–</w:t>
+      </w:r>
+      <w:r>
+        <w:rPr>
+          <w:rFonts w:ascii="David" w:hAnsi="David" w:hint="cs"/>
+          <w:sz w:val="24"/>
+          <w:szCs w:val="24"/>
+          <w:rtl/>
+          <w:lang w:bidi="ar-EG"/>
+        </w:rPr>
+        <w:t>17:45</w:t>
+      </w:r>
+      <w:r>
+        <w:rPr>
+          <w:rFonts w:ascii="David" w:hAnsi="David" w:cs="David"/>
+          <w:sz w:val="24"/>
+          <w:szCs w:val="24"/>
+          <w:rtl/>
+          <w:lang w:bidi="he-IL"/>
+        </w:rPr>
+        <w:t>, באולם מופעים. מחיר חודשי: 200 ₪. מדריך/ה: מיכל לוי</w:t>
       </w:r>
       <w:r>
         <w:rPr>
@@ -567,7 +649,87 @@
           <w:rtl/>
           <w:lang w:bidi="he-IL"/>
         </w:rPr>
-        <w:t>חוג 'חוג ציור לילדים' מיועד לקבוצת גיל ילדים (גילאי 6–10). המפגשים מתקיימים ביום ראשון בשעות 16:00–17:00, בחדר אומנות. מחיר חודשי: 180 ₪. מדריך/ה: מיכל לוי</w:t>
+        <w:t xml:space="preserve">חוג 'חוג ציור לילדים' מיועד לקבוצת גיל ילדים (גילאי </w:t>
+      </w:r>
+      <w:r>
+        <w:rPr>
+          <w:rFonts w:ascii="David" w:hAnsi="David" w:hint="cs"/>
+          <w:sz w:val="24"/>
+          <w:szCs w:val="24"/>
+          <w:rtl/>
+          <w:lang w:bidi="ar-EG"/>
+        </w:rPr>
+        <w:t>10</w:t>
+      </w:r>
+      <w:r>
+        <w:rPr>
+          <w:rFonts w:ascii="David" w:hAnsi="David" w:cs="David"/>
+          <w:sz w:val="24"/>
+          <w:szCs w:val="24"/>
+          <w:rtl/>
+          <w:lang w:bidi="he-IL"/>
+        </w:rPr>
+        <w:t>–</w:t>
+      </w:r>
+      <w:r>
+        <w:rPr>
+          <w:rFonts w:ascii="David" w:hAnsi="David" w:hint="cs"/>
+          <w:sz w:val="24"/>
+          <w:szCs w:val="24"/>
+          <w:rtl/>
+          <w:lang w:bidi="ar-EG"/>
+        </w:rPr>
+        <w:t>6</w:t>
+      </w:r>
+      <w:r>
+        <w:rPr>
+          <w:rFonts w:ascii="David" w:hAnsi="David" w:cs="David"/>
+          <w:sz w:val="24"/>
+          <w:szCs w:val="24"/>
+          <w:rtl/>
+          <w:lang w:bidi="he-IL"/>
+        </w:rPr>
+        <w:t xml:space="preserve">). המפגשים מתקיימים ביום ראשון בשעות </w:t>
+      </w:r>
+      <w:r>
+        <w:rPr>
+          <w:rFonts w:ascii="David" w:hAnsi="David" w:hint="cs"/>
+          <w:sz w:val="24"/>
+          <w:szCs w:val="24"/>
+          <w:rtl/>
+          <w:lang w:bidi="ar-EG"/>
+        </w:rPr>
+        <w:t>17:00</w:t>
+      </w:r>
+      <w:r>
+        <w:rPr>
+          <w:rFonts w:ascii="David" w:hAnsi="David" w:cs="David"/>
+          <w:sz w:val="24"/>
+          <w:szCs w:val="24"/>
+          <w:rtl/>
+          <w:lang w:bidi="he-IL"/>
+        </w:rPr>
+        <w:t>–</w:t>
+      </w:r>
+      <w:r>
+        <w:rPr>
+          <w:rFonts w:ascii="David" w:hAnsi="David" w:hint="cs"/>
+          <w:sz w:val="24"/>
+          <w:szCs w:val="24"/>
+          <w:rtl/>
+          <w:lang w:bidi="ar-EG"/>
+        </w:rPr>
+        <w:t>16:00</w:t>
+      </w:r>
+      <w:r>
+        <w:rPr>
+          <w:rFonts w:ascii="David" w:hAnsi="David" w:cs="David"/>
+          <w:sz w:val="24"/>
+          <w:szCs w:val="24"/>
+          <w:rtl/>
+          <w:lang w:bidi="he-IL"/>
+        </w:rPr>
+        <w:t>, בחדר אומנות. מחיר חודשי: 180 ₪. מדריך/ה: מיכל לוי</w:t>
       </w:r>
       <w:r>
         <w:rPr>
@@ -619,7 +781,87 @@
           <w:rtl/>
           <w:lang w:bidi="he-IL"/>
         </w:rPr>
-        <w:t>חוג 'סריגה ויצירה' מיועד לקבוצת גיל גיל הזהב (גילאי 60–99). המפגשים מתקיימים ביום שלישי בשעות 10:00–11:30, בחדר יצירה. מחיר חודשי: 90 ₪. מדריך/ה: תמר ניסים</w:t>
+        <w:t xml:space="preserve">חוג 'סריגה ויצירה' מיועד לקבוצת גיל גיל הזהב (גילאי </w:t>
+      </w:r>
+      <w:r>
+        <w:rPr>
+          <w:rFonts w:ascii="David" w:hAnsi="David" w:hint="cs"/>
+          <w:sz w:val="24"/>
+          <w:szCs w:val="24"/>
+          <w:rtl/>
+          <w:lang w:bidi="ar-EG"/>
+        </w:rPr>
+        <w:t>99</w:t>
+      </w:r>
+      <w:r>
+        <w:rPr>
+          <w:rFonts w:ascii="David" w:hAnsi="David" w:cs="David"/>
+          <w:sz w:val="24"/>
+          <w:szCs w:val="24"/>
+          <w:rtl/>
+          <w:lang w:bidi="he-IL"/>
+        </w:rPr>
+        <w:t>–</w:t>
+      </w:r>
+      <w:r>
+        <w:rPr>
+          <w:rFonts w:ascii="David" w:hAnsi="David" w:hint="cs"/>
+          <w:sz w:val="24"/>
+          <w:szCs w:val="24"/>
+          <w:rtl/>
+          <w:lang w:bidi="ar-EG"/>
+        </w:rPr>
+        <w:t>60</w:t>
+      </w:r>
+      <w:r>
+        <w:rPr>
+          <w:rFonts w:ascii="David" w:hAnsi="David" w:cs="David"/>
+          <w:sz w:val="24"/>
+          <w:szCs w:val="24"/>
+          <w:rtl/>
+          <w:lang w:bidi="he-IL"/>
+        </w:rPr>
+        <w:t xml:space="preserve">). המפגשים מתקיימים ביום שלישי בשעות </w:t>
+      </w:r>
+      <w:r>
+        <w:rPr>
+          <w:rFonts w:ascii="David" w:hAnsi="David" w:hint="cs"/>
+          <w:sz w:val="24"/>
+          <w:szCs w:val="24"/>
+          <w:rtl/>
+          <w:lang w:bidi="ar-EG"/>
+        </w:rPr>
+        <w:t>11:30</w:t>
+      </w:r>
+      <w:r>
+        <w:rPr>
+          <w:rFonts w:ascii="David" w:hAnsi="David" w:cs="David"/>
+          <w:sz w:val="24"/>
+          <w:szCs w:val="24"/>
+          <w:rtl/>
+          <w:lang w:bidi="he-IL"/>
+        </w:rPr>
+        <w:t>–</w:t>
+      </w:r>
+      <w:r>
+        <w:rPr>
+          <w:rFonts w:ascii="David" w:hAnsi="David" w:hint="cs"/>
+          <w:sz w:val="24"/>
+          <w:szCs w:val="24"/>
+          <w:rtl/>
+          <w:lang w:bidi="ar-EG"/>
+        </w:rPr>
+        <w:t>10:00</w:t>
+      </w:r>
+      <w:r>
+        <w:rPr>
+          <w:rFonts w:ascii="David" w:hAnsi="David" w:cs="David"/>
+          <w:sz w:val="24"/>
+          <w:szCs w:val="24"/>
+          <w:rtl/>
+          <w:lang w:bidi="he-IL"/>
+        </w:rPr>
+        <w:t>, בחדר יצירה. מחיר חודשי: 90 ₪. מדריך/ה: תמר ניסים</w:t>
       </w:r>
       <w:r>
         <w:rPr>
@@ -671,7 +913,87 @@
           <w:rtl/>
           <w:lang w:bidi="he-IL"/>
         </w:rPr>
-        <w:t>חוג 'ציור בצבעי מים' מיועד לקבוצת גיל גיל הזהב (גילאי 60–99). המפגשים מתקיימים ביום חמישי בשעות 10:00–11:30, בחדר אומנות. מחיר חודשי: 130 ₪. מדריך/ה: מיכל לוי</w:t>
+        <w:t xml:space="preserve">חוג 'ציור בצבעי מים' מיועד לקבוצת גיל גיל הזהב (גילאי </w:t>
+      </w:r>
+      <w:r>
+        <w:rPr>
+          <w:rFonts w:ascii="David" w:hAnsi="David" w:hint="cs"/>
+          <w:sz w:val="24"/>
+          <w:szCs w:val="24"/>
+          <w:rtl/>
+          <w:lang w:bidi="ar-EG"/>
+        </w:rPr>
+        <w:t>99</w:t>
+      </w:r>
+      <w:r>
+        <w:rPr>
+          <w:rFonts w:ascii="David" w:hAnsi="David" w:cs="David"/>
+          <w:sz w:val="24"/>
+          <w:szCs w:val="24"/>
+          <w:rtl/>
+          <w:lang w:bidi="he-IL"/>
+        </w:rPr>
+        <w:t>–</w:t>
+      </w:r>
+      <w:r>
+        <w:rPr>
+          <w:rFonts w:ascii="David" w:hAnsi="David" w:hint="cs"/>
+          <w:sz w:val="24"/>
+          <w:szCs w:val="24"/>
+          <w:rtl/>
+          <w:lang w:bidi="ar-EG"/>
+        </w:rPr>
+        <w:t>60</w:t>
+      </w:r>
+      <w:r>
+        <w:rPr>
+          <w:rFonts w:ascii="David" w:hAnsi="David" w:cs="David"/>
+          <w:sz w:val="24"/>
+          <w:szCs w:val="24"/>
+          <w:rtl/>
+          <w:lang w:bidi="he-IL"/>
+        </w:rPr>
+        <w:t xml:space="preserve">). המפגשים מתקיימים ביום חמישי בשעות </w:t>
+      </w:r>
+      <w:r>
+        <w:rPr>
+          <w:rFonts w:ascii="David" w:hAnsi="David" w:hint="cs"/>
+          <w:sz w:val="24"/>
+          <w:szCs w:val="24"/>
+          <w:rtl/>
+          <w:lang w:bidi="ar-EG"/>
+        </w:rPr>
+        <w:t>11:30</w:t>
+      </w:r>
+      <w:r>
+        <w:rPr>
+          <w:rFonts w:ascii="David" w:hAnsi="David" w:cs="David"/>
+          <w:sz w:val="24"/>
+          <w:szCs w:val="24"/>
+          <w:rtl/>
+          <w:lang w:bidi="he-IL"/>
+        </w:rPr>
+        <w:t>–</w:t>
+      </w:r>
+      <w:r>
+        <w:rPr>
+          <w:rFonts w:ascii="David" w:hAnsi="David" w:hint="cs"/>
+          <w:sz w:val="24"/>
+          <w:szCs w:val="24"/>
+          <w:rtl/>
+          <w:lang w:bidi="ar-EG"/>
+        </w:rPr>
+        <w:t>10:0</w:t>
+      </w:r>
+      <w:r>
+        <w:rPr>
+          <w:rFonts w:ascii="David" w:hAnsi="David" w:cs="David"/>
+          <w:sz w:val="24"/>
+          <w:szCs w:val="24"/>
+          <w:rtl/>
+          <w:lang w:bidi="he-IL"/>
+        </w:rPr>
+        <w:t>0, בחדר אומנות. מחיר חודשי: 130 ₪. מדריך/ה: מיכל לוי</w:t>
       </w:r>
       <w:r>
         <w:rPr>
@@ -725,7 +1047,47 @@
           <w:rtl/>
           <w:lang w:bidi="he-IL"/>
         </w:rPr>
-        <w:t>חוג 'קרמיקה למבוגרים' מיועד לקבוצת גיל מבוגרים (גילאי 18–70). המפגשים מתקיימים ביום רביעי בשעות 18:00–20:00, בחדר אומנות. מחיר חודשי: 280 ₪. מדריך/ה: מיכל לוי</w:t>
+        <w:t xml:space="preserve">חוג 'קרמיקה למבוגרים' מיועד לקבוצת גיל מבוגרים (גילאי 18–70). המפגשים מתקיימים ביום רביעי בשעות </w:t>
+      </w:r>
+      <w:r>
+        <w:rPr>
+          <w:rFonts w:ascii="David" w:hAnsi="David" w:hint="cs"/>
+          <w:sz w:val="24"/>
+          <w:szCs w:val="24"/>
+          <w:rtl/>
+          <w:lang w:bidi="ar-EG"/>
+        </w:rPr>
+        <w:t>20:00</w:t>
+      </w:r>
+      <w:r>
+        <w:rPr>
+          <w:rFonts w:ascii="David" w:hAnsi="David" w:cs="David"/>
+          <w:sz w:val="24"/>
+          <w:szCs w:val="24"/>
+          <w:rtl/>
+          <w:lang w:bidi="he-IL"/>
+        </w:rPr>
+        <w:t>–</w:t>
+      </w:r>
+      <w:r>
+        <w:rPr>
+          <w:rFonts w:ascii="David" w:hAnsi="David" w:hint="cs"/>
+          <w:sz w:val="24"/>
+          <w:szCs w:val="24"/>
+          <w:rtl/>
+          <w:lang w:bidi="ar-EG"/>
+        </w:rPr>
+        <w:t>18:00</w:t>
+      </w:r>
+      <w:r>
+        <w:rPr>
+          <w:rFonts w:ascii="David" w:hAnsi="David" w:cs="David"/>
+          <w:sz w:val="24"/>
+          <w:szCs w:val="24"/>
+          <w:rtl/>
+          <w:lang w:bidi="he-IL"/>
+        </w:rPr>
+        <w:t>, בחדר אומנות. מחיר חודשי: 280 ₪. מדריך/ה: מיכל לוי</w:t>
       </w:r>
       <w:r>
         <w:rPr>
@@ -779,7 +1141,107 @@
           <w:rtl/>
           <w:lang w:bidi="he-IL"/>
         </w:rPr>
-        <w:t>חוג 'תיאטרון לנוער' מיועד לקבוצת גיל נוער (גילאי 13–17). המפגשים מתקיימים ביום חמישי בשעות 18:00–19:30, באולם מופעים. מחיר חודשי: 230 ₪. מדריך/ה: מיכל לוי</w:t>
+        <w:t xml:space="preserve">חוג 'תיאטרון לנוער' מיועד לקבוצת גיל נוער (גילאי </w:t>
+      </w:r>
+      <w:r>
+        <w:rPr>
+          <w:rFonts w:ascii="David" w:hAnsi="David" w:hint="cs"/>
+          <w:sz w:val="24"/>
+          <w:szCs w:val="24"/>
+          <w:rtl/>
+          <w:lang w:bidi="ar-EG"/>
+        </w:rPr>
+        <w:t>17</w:t>
+      </w:r>
+      <w:r>
+        <w:rPr>
+          <w:rFonts w:ascii="David" w:hAnsi="David" w:cs="David"/>
+          <w:sz w:val="24"/>
+          <w:szCs w:val="24"/>
+          <w:rtl/>
+          <w:lang w:bidi="he-IL"/>
+        </w:rPr>
+        <w:t>–</w:t>
+      </w:r>
+      <w:r>
+        <w:rPr>
+          <w:rFonts w:ascii="David" w:hAnsi="David" w:hint="cs"/>
+          <w:sz w:val="24"/>
+          <w:szCs w:val="24"/>
+          <w:rtl/>
+          <w:lang w:bidi="ar-EG"/>
+        </w:rPr>
+        <w:t>13</w:t>
+      </w:r>
+      <w:r>
+        <w:rPr>
+          <w:rFonts w:ascii="David" w:hAnsi="David" w:cs="David"/>
+          <w:sz w:val="24"/>
+          <w:szCs w:val="24"/>
+          <w:rtl/>
+          <w:lang w:bidi="he-IL"/>
+        </w:rPr>
+        <w:t>). המפגשים מתקיימים ביום חמישי בשעות</w:t>
+      </w:r>
+      <w:r>
+        <w:rPr>
+          <w:rFonts w:ascii="David" w:hAnsi="David" w:hint="cs"/>
+          <w:sz w:val="24"/>
+          <w:szCs w:val="24"/>
+          <w:rtl/>
+          <w:lang w:bidi="ar-EG"/>
+        </w:rPr>
+        <w:t xml:space="preserve"> </w:t>
+      </w:r>
+      <w:r>
+        <w:rPr>
+          <w:rFonts w:ascii="David" w:hAnsi="David" w:cs="David"/>
+          <w:sz w:val="24"/>
+          <w:szCs w:val="24"/>
+          <w:rtl/>
+          <w:lang w:bidi="he-IL"/>
+        </w:rPr>
+        <w:t xml:space="preserve"> </w:t>
+      </w:r>
+      <w:r>
+        <w:rPr>
+          <w:rFonts w:ascii="David" w:hAnsi="David" w:hint="cs"/>
+          <w:sz w:val="24"/>
+          <w:szCs w:val="24"/>
+          <w:rtl/>
+          <w:lang w:bidi="ar-EG"/>
+        </w:rPr>
+        <w:t>19:30</w:t>
+      </w:r>
+      <w:r>
+        <w:rPr>
+          <w:rFonts w:ascii="David" w:hAnsi="David" w:cs="David"/>
+          <w:sz w:val="24"/>
+          <w:szCs w:val="24"/>
+          <w:rtl/>
+          <w:lang w:bidi="he-IL"/>
+        </w:rPr>
+        <w:t>–</w:t>
+      </w:r>
+      <w:r>
+        <w:rPr>
+          <w:rFonts w:ascii="David" w:hAnsi="David" w:hint="cs"/>
+          <w:sz w:val="24"/>
+          <w:szCs w:val="24"/>
+          <w:rtl/>
+          <w:lang w:bidi="ar-EG"/>
+        </w:rPr>
+        <w:t>18:00</w:t>
+      </w:r>
+      <w:r>
+        <w:rPr>
+          <w:rFonts w:ascii="David" w:hAnsi="David" w:cs="David"/>
+          <w:sz w:val="24"/>
+          <w:szCs w:val="24"/>
+          <w:rtl/>
+          <w:lang w:bidi="he-IL"/>
+        </w:rPr>
+        <w:t>, באולם מופעים. מחיר חודשי: 230 ₪. מדריך/ה: מיכל לוי</w:t>
       </w:r>
       <w:r>
         <w:rPr>
@@ -885,7 +1347,87 @@
           <w:rtl/>
           <w:lang w:bidi="he-IL"/>
         </w:rPr>
-        <w:t>חוג 'הורים וילדים בתנועה' מיועד לקבוצת גיל גיל הרך (גילאי 2–4). המפגשים מתקיימים ביום שלישי בשעות 16:00–16:45, באולם תנועה. מחיר חודשי: 150 ₪. מדריך/ה: שרית דיין</w:t>
+        <w:t xml:space="preserve">חוג 'הורים וילדים בתנועה' מיועד לקבוצת גיל גיל הרך (גילאי </w:t>
+      </w:r>
+      <w:r>
+        <w:rPr>
+          <w:rFonts w:ascii="David" w:hAnsi="David" w:hint="cs"/>
+          <w:sz w:val="24"/>
+          <w:szCs w:val="24"/>
+          <w:rtl/>
+          <w:lang w:bidi="ar-EG"/>
+        </w:rPr>
+        <w:t>4</w:t>
+      </w:r>
+      <w:r>
+        <w:rPr>
+          <w:rFonts w:ascii="David" w:hAnsi="David" w:cs="David"/>
+          <w:sz w:val="24"/>
+          <w:szCs w:val="24"/>
+          <w:rtl/>
+          <w:lang w:bidi="he-IL"/>
+        </w:rPr>
+        <w:t>–</w:t>
+      </w:r>
+      <w:r>
+        <w:rPr>
+          <w:rFonts w:ascii="David" w:hAnsi="David" w:hint="cs"/>
+          <w:sz w:val="24"/>
+          <w:szCs w:val="24"/>
+          <w:rtl/>
+          <w:lang w:bidi="ar-EG"/>
+        </w:rPr>
+        <w:t>2</w:t>
+      </w:r>
+      <w:r>
+        <w:rPr>
+          <w:rFonts w:ascii="David" w:hAnsi="David" w:cs="David"/>
+          <w:sz w:val="24"/>
+          <w:szCs w:val="24"/>
+          <w:rtl/>
+          <w:lang w:bidi="he-IL"/>
+        </w:rPr>
+        <w:t xml:space="preserve">). המפגשים מתקיימים ביום שלישי בשעות </w:t>
+      </w:r>
+      <w:r>
+        <w:rPr>
+          <w:rFonts w:ascii="David" w:hAnsi="David" w:hint="cs"/>
+          <w:sz w:val="24"/>
+          <w:szCs w:val="24"/>
+          <w:rtl/>
+          <w:lang w:bidi="ar-EG"/>
+        </w:rPr>
+        <w:t>16:45</w:t>
+      </w:r>
+      <w:r>
+        <w:rPr>
+          <w:rFonts w:ascii="David" w:hAnsi="David" w:cs="David"/>
+          <w:sz w:val="24"/>
+          <w:szCs w:val="24"/>
+          <w:rtl/>
+          <w:lang w:bidi="he-IL"/>
+        </w:rPr>
+        <w:t>–</w:t>
+      </w:r>
+      <w:r>
+        <w:rPr>
+          <w:rFonts w:ascii="David" w:hAnsi="David" w:hint="cs"/>
+          <w:sz w:val="24"/>
+          <w:szCs w:val="24"/>
+          <w:rtl/>
+          <w:lang w:bidi="ar-EG"/>
+        </w:rPr>
+        <w:t>16:00</w:t>
+      </w:r>
+      <w:r>
+        <w:rPr>
+          <w:rFonts w:ascii="David" w:hAnsi="David" w:cs="David"/>
+          <w:sz w:val="24"/>
+          <w:szCs w:val="24"/>
+          <w:rtl/>
+          <w:lang w:bidi="he-IL"/>
+        </w:rPr>
+        <w:t>, באולם תנועה. מחיר חודשי: 150 ₪. מדריך/ה: שרית דיין</w:t>
       </w:r>
       <w:r>
         <w:rPr>
@@ -978,6 +1520,7 @@
           <w:rtl/>
           <w:lang w:bidi="he-IL"/>
         </w:rPr>
+        <w:lastRenderedPageBreak/>
         <w:t>מחשבים לגיל הזהב</w:t>
       </w:r>
     </w:p>
@@ -999,7 +1542,87 @@
           <w:rtl/>
           <w:lang w:bidi="he-IL"/>
         </w:rPr>
-        <w:t>חוג 'מחשבים לגיל הזהב' מיועד לקבוצת גיל גיל הזהב (גילאי 60–99). המפגשים מתקיימים ביום ראשון בשעות 10:00–11:30, במעבדת מחשבים. מחיר חודשי: 120 ₪. מדריך/ה: אמיר חדד</w:t>
+        <w:t xml:space="preserve">חוג 'מחשבים לגיל הזהב' מיועד לקבוצת גיל גיל הזהב (גילאי </w:t>
+      </w:r>
+      <w:r>
+        <w:rPr>
+          <w:rFonts w:ascii="David" w:hAnsi="David" w:hint="cs"/>
+          <w:sz w:val="24"/>
+          <w:szCs w:val="24"/>
+          <w:rtl/>
+          <w:lang w:bidi="ar-EG"/>
+        </w:rPr>
+        <w:t>99</w:t>
+      </w:r>
+      <w:r>
+        <w:rPr>
+          <w:rFonts w:ascii="David" w:hAnsi="David" w:cs="David"/>
+          <w:sz w:val="24"/>
+          <w:szCs w:val="24"/>
+          <w:rtl/>
+          <w:lang w:bidi="he-IL"/>
+        </w:rPr>
+        <w:t>–</w:t>
+      </w:r>
+      <w:r>
+        <w:rPr>
+          <w:rFonts w:ascii="David" w:hAnsi="David" w:hint="cs"/>
+          <w:sz w:val="24"/>
+          <w:szCs w:val="24"/>
+          <w:rtl/>
+          <w:lang w:bidi="ar-EG"/>
+        </w:rPr>
+        <w:t>60</w:t>
+      </w:r>
+      <w:r>
+        <w:rPr>
+          <w:rFonts w:ascii="David" w:hAnsi="David" w:cs="David"/>
+          <w:sz w:val="24"/>
+          <w:szCs w:val="24"/>
+          <w:rtl/>
+          <w:lang w:bidi="he-IL"/>
+        </w:rPr>
+        <w:t xml:space="preserve">). המפגשים מתקיימים ביום ראשון בשעות </w:t>
+      </w:r>
+      <w:r>
+        <w:rPr>
+          <w:rFonts w:ascii="David" w:hAnsi="David" w:hint="cs"/>
+          <w:sz w:val="24"/>
+          <w:szCs w:val="24"/>
+          <w:rtl/>
+          <w:lang w:bidi="ar-EG"/>
+        </w:rPr>
+        <w:t>11:30</w:t>
+      </w:r>
+      <w:r>
+        <w:rPr>
+          <w:rFonts w:ascii="David" w:hAnsi="David" w:cs="David"/>
+          <w:sz w:val="24"/>
+          <w:szCs w:val="24"/>
+          <w:rtl/>
+          <w:lang w:bidi="he-IL"/>
+        </w:rPr>
+        <w:t>–</w:t>
+      </w:r>
+      <w:r>
+        <w:rPr>
+          <w:rFonts w:ascii="David" w:hAnsi="David" w:hint="cs"/>
+          <w:sz w:val="24"/>
+          <w:szCs w:val="24"/>
+          <w:rtl/>
+          <w:lang w:bidi="ar-EG"/>
+        </w:rPr>
+        <w:t>10:00</w:t>
+      </w:r>
+      <w:r>
+        <w:rPr>
+          <w:rFonts w:ascii="David" w:hAnsi="David" w:cs="David"/>
+          <w:sz w:val="24"/>
+          <w:szCs w:val="24"/>
+          <w:rtl/>
+          <w:lang w:bidi="he-IL"/>
+        </w:rPr>
+        <w:t>, במעבדת מחשבים. מחיר חודשי: 120 ₪. מדריך/ה: אמיר חדד</w:t>
       </w:r>
       <w:r>
         <w:rPr>
@@ -1051,7 +1674,87 @@
           <w:rtl/>
           <w:lang w:bidi="he-IL"/>
         </w:rPr>
-        <w:t>חוג 'צילום בסמארטפון' מיועד לקבוצת גיל מבוגרים (גילאי 18–70). המפגשים מתקיימים ביום חמישי בשעות 19:00–20:30, בכיתה 2. מחיר חודשי: 180 ₪. מדריך/ה: דניאל פרץ</w:t>
+        <w:t xml:space="preserve">חוג 'צילום בסמארטפון' מיועד לקבוצת גיל מבוגרים (גילאי </w:t>
+      </w:r>
+      <w:r>
+        <w:rPr>
+          <w:rFonts w:ascii="David" w:hAnsi="David" w:hint="cs"/>
+          <w:sz w:val="24"/>
+          <w:szCs w:val="24"/>
+          <w:rtl/>
+          <w:lang w:bidi="ar-EG"/>
+        </w:rPr>
+        <w:t>70</w:t>
+      </w:r>
+      <w:r>
+        <w:rPr>
+          <w:rFonts w:ascii="David" w:hAnsi="David" w:cs="David"/>
+          <w:sz w:val="24"/>
+          <w:szCs w:val="24"/>
+          <w:rtl/>
+          <w:lang w:bidi="he-IL"/>
+        </w:rPr>
+        <w:t>–</w:t>
+      </w:r>
+      <w:r>
+        <w:rPr>
+          <w:rFonts w:ascii="David" w:hAnsi="David" w:hint="cs"/>
+          <w:sz w:val="24"/>
+          <w:szCs w:val="24"/>
+          <w:rtl/>
+          <w:lang w:bidi="ar-EG"/>
+        </w:rPr>
+        <w:t>18</w:t>
+      </w:r>
+      <w:r>
+        <w:rPr>
+          <w:rFonts w:ascii="David" w:hAnsi="David" w:cs="David"/>
+          <w:sz w:val="24"/>
+          <w:szCs w:val="24"/>
+          <w:rtl/>
+          <w:lang w:bidi="he-IL"/>
+        </w:rPr>
+        <w:t xml:space="preserve">). המפגשים מתקיימים ביום חמישי בשעות </w:t>
+      </w:r>
+      <w:r>
+        <w:rPr>
+          <w:rFonts w:ascii="David" w:hAnsi="David" w:hint="cs"/>
+          <w:sz w:val="24"/>
+          <w:szCs w:val="24"/>
+          <w:rtl/>
+          <w:lang w:bidi="ar-EG"/>
+        </w:rPr>
+        <w:t>20:30</w:t>
+      </w:r>
+      <w:r>
+        <w:rPr>
+          <w:rFonts w:ascii="David" w:hAnsi="David" w:cs="David"/>
+          <w:sz w:val="24"/>
+          <w:szCs w:val="24"/>
+          <w:rtl/>
+          <w:lang w:bidi="he-IL"/>
+        </w:rPr>
+        <w:t>–</w:t>
+      </w:r>
+      <w:r>
+        <w:rPr>
+          <w:rFonts w:ascii="David" w:hAnsi="David" w:hint="cs"/>
+          <w:sz w:val="24"/>
+          <w:szCs w:val="24"/>
+          <w:rtl/>
+          <w:lang w:bidi="ar-EG"/>
+        </w:rPr>
+        <w:t>19:00</w:t>
+      </w:r>
+      <w:r>
+        <w:rPr>
+          <w:rFonts w:ascii="David" w:hAnsi="David" w:cs="David"/>
+          <w:sz w:val="24"/>
+          <w:szCs w:val="24"/>
+          <w:rtl/>
+          <w:lang w:bidi="he-IL"/>
+        </w:rPr>
+        <w:t>, בכיתה 2. מחיר חודשי: 180 ₪. מדריך/ה: דניאל פרץ</w:t>
       </w:r>
       <w:r>
         <w:rPr>
@@ -1105,7 +1808,87 @@
           <w:rtl/>
           <w:lang w:bidi="he-IL"/>
         </w:rPr>
-        <w:t>חוג 'רובוטיקה לנוער' מיועד לקבוצת גיל נוער (גילאי 12–16). המפגשים מתקיימים ביום שלישי בשעות 18:00–19:30, במעבדת מחשבים. מחיר חודשי: 260 ₪. מדריך/ה: אמיר חדד</w:t>
+        <w:t xml:space="preserve">חוג 'רובוטיקה לנוער' מיועד לקבוצת גיל נוער (גילאי </w:t>
+      </w:r>
+      <w:r>
+        <w:rPr>
+          <w:rFonts w:ascii="David" w:hAnsi="David" w:hint="cs"/>
+          <w:sz w:val="24"/>
+          <w:szCs w:val="24"/>
+          <w:rtl/>
+          <w:lang w:bidi="ar-EG"/>
+        </w:rPr>
+        <w:t>16</w:t>
+      </w:r>
+      <w:r>
+        <w:rPr>
+          <w:rFonts w:ascii="David" w:hAnsi="David" w:cs="David"/>
+          <w:sz w:val="24"/>
+          <w:szCs w:val="24"/>
+          <w:rtl/>
+          <w:lang w:bidi="he-IL"/>
+        </w:rPr>
+        <w:t>–</w:t>
+      </w:r>
+      <w:r>
+        <w:rPr>
+          <w:rFonts w:ascii="David" w:hAnsi="David" w:hint="cs"/>
+          <w:sz w:val="24"/>
+          <w:szCs w:val="24"/>
+          <w:rtl/>
+          <w:lang w:bidi="ar-EG"/>
+        </w:rPr>
+        <w:t>12</w:t>
+      </w:r>
+      <w:r>
+        <w:rPr>
+          <w:rFonts w:ascii="David" w:hAnsi="David" w:cs="David"/>
+          <w:sz w:val="24"/>
+          <w:szCs w:val="24"/>
+          <w:rtl/>
+          <w:lang w:bidi="he-IL"/>
+        </w:rPr>
+        <w:t xml:space="preserve">). המפגשים מתקיימים ביום שלישי בשעות </w:t>
+      </w:r>
+      <w:r>
+        <w:rPr>
+          <w:rFonts w:ascii="David" w:hAnsi="David" w:hint="cs"/>
+          <w:sz w:val="24"/>
+          <w:szCs w:val="24"/>
+          <w:rtl/>
+          <w:lang w:bidi="ar-EG"/>
+        </w:rPr>
+        <w:t>19:30</w:t>
+      </w:r>
+      <w:r>
+        <w:rPr>
+          <w:rFonts w:ascii="David" w:hAnsi="David" w:cs="David"/>
+          <w:sz w:val="24"/>
+          <w:szCs w:val="24"/>
+          <w:rtl/>
+          <w:lang w:bidi="he-IL"/>
+        </w:rPr>
+        <w:t>–</w:t>
+      </w:r>
+      <w:r>
+        <w:rPr>
+          <w:rFonts w:ascii="David" w:hAnsi="David" w:hint="cs"/>
+          <w:sz w:val="24"/>
+          <w:szCs w:val="24"/>
+          <w:rtl/>
+          <w:lang w:bidi="ar-EG"/>
+        </w:rPr>
+        <w:t>18:00</w:t>
+      </w:r>
+      <w:r>
+        <w:rPr>
+          <w:rFonts w:ascii="David" w:hAnsi="David" w:cs="David"/>
+          <w:sz w:val="24"/>
+          <w:szCs w:val="24"/>
+          <w:rtl/>
+          <w:lang w:bidi="he-IL"/>
+        </w:rPr>
+        <w:t>, במעבדת מחשבים. מחיר חודשי: 260 ₪. מדריך/ה: אמיר חדד</w:t>
       </w:r>
       <w:r>
         <w:rPr>
@@ -1211,7 +1994,107 @@
           <w:rtl/>
           <w:lang w:bidi="he-IL"/>
         </w:rPr>
-        <w:t>חוג 'מוזיקה לגיל הרך' מיועד לקבוצת גיל גיל הרך (גילאי 3–5). המפגשים מתקיימים ביום שני בשעות 16:00–16:45, בחדר מוזיקה. מחיר חודשי: 160 ₪. מדריך/ה: שרית דיין</w:t>
+        <w:t xml:space="preserve">חוג 'מוזיקה לגיל הרך' מיועד לקבוצת גיל גיל הרך (גילאי </w:t>
+      </w:r>
+      <w:r>
+        <w:rPr>
+          <w:rFonts w:ascii="David" w:hAnsi="David" w:hint="cs"/>
+          <w:sz w:val="24"/>
+          <w:szCs w:val="24"/>
+          <w:rtl/>
+          <w:lang w:bidi="ar-EG"/>
+        </w:rPr>
+        <w:t>5</w:t>
+      </w:r>
+      <w:r>
+        <w:rPr>
+          <w:rFonts w:ascii="David" w:hAnsi="David" w:cs="David"/>
+          <w:sz w:val="24"/>
+          <w:szCs w:val="24"/>
+          <w:rtl/>
+          <w:lang w:bidi="he-IL"/>
+        </w:rPr>
+        <w:t>–</w:t>
+      </w:r>
+      <w:r>
+        <w:rPr>
+          <w:rFonts w:ascii="David" w:hAnsi="David" w:hint="cs"/>
+          <w:sz w:val="24"/>
+          <w:szCs w:val="24"/>
+          <w:rtl/>
+          <w:lang w:bidi="ar-EG"/>
+        </w:rPr>
+        <w:t>3</w:t>
+      </w:r>
+      <w:r>
+        <w:rPr>
+          <w:rFonts w:ascii="David" w:hAnsi="David" w:cs="David"/>
+          <w:sz w:val="24"/>
+          <w:szCs w:val="24"/>
+          <w:rtl/>
+          <w:lang w:bidi="he-IL"/>
+        </w:rPr>
+        <w:t>). המפגשים מתקיימים ביום שני בשעות</w:t>
+      </w:r>
+      <w:r>
+        <w:rPr>
+          <w:rFonts w:ascii="David" w:hAnsi="David" w:hint="cs"/>
+          <w:sz w:val="24"/>
+          <w:szCs w:val="24"/>
+          <w:rtl/>
+          <w:lang w:bidi="ar-EG"/>
+        </w:rPr>
+        <w:t xml:space="preserve"> </w:t>
+      </w:r>
+      <w:r>
+        <w:rPr>
+          <w:rFonts w:ascii="David" w:hAnsi="David" w:cs="David"/>
+          <w:sz w:val="24"/>
+          <w:szCs w:val="24"/>
+          <w:rtl/>
+          <w:lang w:bidi="he-IL"/>
+        </w:rPr>
+        <w:t xml:space="preserve"> </w:t>
+      </w:r>
+      <w:r>
+        <w:rPr>
+          <w:rFonts w:ascii="David" w:hAnsi="David" w:hint="cs"/>
+          <w:sz w:val="24"/>
+          <w:szCs w:val="24"/>
+          <w:rtl/>
+          <w:lang w:bidi="ar-EG"/>
+        </w:rPr>
+        <w:t>16:45</w:t>
+      </w:r>
+      <w:r>
+        <w:rPr>
+          <w:rFonts w:ascii="David" w:hAnsi="David" w:cs="David"/>
+          <w:sz w:val="24"/>
+          <w:szCs w:val="24"/>
+          <w:rtl/>
+          <w:lang w:bidi="he-IL"/>
+        </w:rPr>
+        <w:t>–</w:t>
+      </w:r>
+      <w:r>
+        <w:rPr>
+          <w:rFonts w:ascii="David" w:hAnsi="David" w:hint="cs"/>
+          <w:sz w:val="24"/>
+          <w:szCs w:val="24"/>
+          <w:rtl/>
+          <w:lang w:bidi="ar-EG"/>
+        </w:rPr>
+        <w:t>16:00</w:t>
+      </w:r>
+      <w:r>
+        <w:rPr>
+          <w:rFonts w:ascii="David" w:hAnsi="David" w:cs="David"/>
+          <w:sz w:val="24"/>
+          <w:szCs w:val="24"/>
+          <w:rtl/>
+          <w:lang w:bidi="he-IL"/>
+        </w:rPr>
+        <w:t>, בחדר מוזיקה. מחיר חודשי: 160 ₪. מדריך/ה: שרית דיין</w:t>
       </w:r>
       <w:r>
         <w:rPr>
@@ -1263,7 +2146,83 @@
           <w:rtl/>
           <w:lang w:bidi="he-IL"/>
         </w:rPr>
-        <w:t>חוג 'מקהלה קהילתית' מיועד לקבוצת גיל מבוגרים (גילאי 18–80). המפגשים מתקיימים ביום ראשון בשעות 20:00–21:30, בחדר מוזיקה. מחיר חודשי: 110 ₪. מדריך/ה: שרית דיין</w:t>
+        <w:t xml:space="preserve">חוג 'מקהלה קהילתית' מיועד לקבוצת גיל מבוגרים (גילאי </w:t>
+      </w:r>
+      <w:r>
+        <w:rPr>
+          <w:rFonts w:ascii="David" w:hAnsi="David" w:cs="David"/>
+          <w:sz w:val="24"/>
+          <w:szCs w:val="24"/>
+          <w:lang w:bidi="he-IL"/>
+        </w:rPr>
+        <w:t>80</w:t>
+      </w:r>
+      <w:r>
+        <w:rPr>
+          <w:rFonts w:ascii="David" w:hAnsi="David" w:cs="David"/>
+          <w:sz w:val="24"/>
+          <w:szCs w:val="24"/>
+          <w:rtl/>
+          <w:lang w:bidi="he-IL"/>
+        </w:rPr>
+        <w:t>–</w:t>
+      </w:r>
+      <w:r>
+        <w:rPr>
+          <w:rFonts w:ascii="David" w:hAnsi="David" w:cs="David"/>
+          <w:sz w:val="24"/>
+          <w:szCs w:val="24"/>
+          <w:lang w:bidi="he-IL"/>
+        </w:rPr>
+        <w:t>18</w:t>
+      </w:r>
+      <w:r>
+        <w:rPr>
+          <w:rFonts w:ascii="David" w:hAnsi="David" w:cs="David"/>
+          <w:sz w:val="24"/>
+          <w:szCs w:val="24"/>
+          <w:rtl/>
+          <w:lang w:bidi="he-IL"/>
+        </w:rPr>
+        <w:t xml:space="preserve">). המפגשים מתקיימים ביום ראשון בשעות </w:t>
+      </w:r>
+      <w:r>
+        <w:rPr>
+          <w:rFonts w:ascii="David" w:hAnsi="David" w:cs="David"/>
+          <w:sz w:val="24"/>
+          <w:szCs w:val="24"/>
+          <w:lang w:bidi="he-IL"/>
+        </w:rPr>
+        <w:t>21:30</w:t>
+      </w:r>
+      <w:r>
+        <w:rPr>
+          <w:rFonts w:ascii="David" w:hAnsi="David" w:cs="David"/>
+          <w:sz w:val="24"/>
+          <w:szCs w:val="24"/>
+          <w:rtl/>
+          <w:lang w:bidi="he-IL"/>
+        </w:rPr>
+        <w:t>–</w:t>
+      </w:r>
+      <w:r>
+        <w:rPr>
+          <w:rFonts w:ascii="David" w:hAnsi="David" w:cs="David"/>
+          <w:sz w:val="24"/>
+          <w:szCs w:val="24"/>
+          <w:lang w:bidi="he-IL"/>
+        </w:rPr>
+        <w:t>20:00</w:t>
+      </w:r>
+      <w:r>
+        <w:rPr>
+          <w:rFonts w:ascii="David" w:hAnsi="David" w:cs="David"/>
+          <w:sz w:val="24"/>
+          <w:szCs w:val="24"/>
+          <w:rtl/>
+          <w:lang w:bidi="he-IL"/>
+        </w:rPr>
+        <w:t>, בחדר מוזיקה. מחיר חודשי: 110 ₪. מדריך/ה: שרית דיין</w:t>
       </w:r>
       <w:r>
         <w:rPr>
@@ -1315,7 +2274,83 @@
           <w:rtl/>
           <w:lang w:bidi="he-IL"/>
         </w:rPr>
-        <w:t>חוג 'סיפור ושיר לגיל הרך' מיועד לקבוצת גיל גיל הרך (גילאי 3–5). המפגשים מתקיימים ביום ראשון בשעות 16:30–17:15, בספרייה. מחיר חודשי: 140 ₪. מדריך/ה: שרית דיין</w:t>
+        <w:t xml:space="preserve">חוג 'סיפור ושיר לגיל הרך' מיועד לקבוצת גיל גיל הרך (גילאי </w:t>
+      </w:r>
+      <w:r>
+        <w:rPr>
+          <w:rFonts w:ascii="David" w:hAnsi="David" w:cs="David"/>
+          <w:sz w:val="24"/>
+          <w:szCs w:val="24"/>
+          <w:lang w:bidi="he-IL"/>
+        </w:rPr>
+        <w:t>5</w:t>
+      </w:r>
+      <w:r>
+        <w:rPr>
+          <w:rFonts w:ascii="David" w:hAnsi="David" w:cs="David"/>
+          <w:sz w:val="24"/>
+          <w:szCs w:val="24"/>
+          <w:rtl/>
+          <w:lang w:bidi="he-IL"/>
+        </w:rPr>
+        <w:t>–</w:t>
+      </w:r>
+      <w:r>
+        <w:rPr>
+          <w:rFonts w:ascii="David" w:hAnsi="David" w:cs="David"/>
+          <w:sz w:val="24"/>
+          <w:szCs w:val="24"/>
+          <w:lang w:bidi="he-IL"/>
+        </w:rPr>
+        <w:t>3</w:t>
+      </w:r>
+      <w:r>
+        <w:rPr>
+          <w:rFonts w:ascii="David" w:hAnsi="David" w:cs="David"/>
+          <w:sz w:val="24"/>
+          <w:szCs w:val="24"/>
+          <w:rtl/>
+          <w:lang w:bidi="he-IL"/>
+        </w:rPr>
+        <w:t xml:space="preserve">). המפגשים מתקיימים ביום ראשון בשעות </w:t>
+      </w:r>
+      <w:r>
+        <w:rPr>
+          <w:rFonts w:ascii="David" w:hAnsi="David" w:cs="David"/>
+          <w:sz w:val="24"/>
+          <w:szCs w:val="24"/>
+          <w:lang w:bidi="he-IL"/>
+        </w:rPr>
+        <w:t>17:15</w:t>
+      </w:r>
+      <w:r>
+        <w:rPr>
+          <w:rFonts w:ascii="David" w:hAnsi="David" w:cs="David"/>
+          <w:sz w:val="24"/>
+          <w:szCs w:val="24"/>
+          <w:rtl/>
+          <w:lang w:bidi="he-IL"/>
+        </w:rPr>
+        <w:t>–</w:t>
+      </w:r>
+      <w:r>
+        <w:rPr>
+          <w:rFonts w:ascii="David" w:hAnsi="David" w:cs="David"/>
+          <w:sz w:val="24"/>
+          <w:szCs w:val="24"/>
+          <w:lang w:bidi="he-IL"/>
+        </w:rPr>
+        <w:t>16:30</w:t>
+      </w:r>
+      <w:r>
+        <w:rPr>
+          <w:rFonts w:ascii="David" w:hAnsi="David" w:cs="David"/>
+          <w:sz w:val="24"/>
+          <w:szCs w:val="24"/>
+          <w:rtl/>
+          <w:lang w:bidi="he-IL"/>
+        </w:rPr>
+        <w:t>, בספרייה. מחיר חודשי: 140 ₪. מדריך/ה: שרית דיין</w:t>
       </w:r>
       <w:r>
         <w:rPr>
@@ -1411,18 +2446,112 @@
           <w:rFonts w:ascii="David" w:hAnsi="David" w:cs="David"/>
           <w:sz w:val="24"/>
           <w:szCs w:val="24"/>
-          <w:rtl/>
-        </w:rPr>
-      </w:pPr>
-      <w:r>
-        <w:rPr>
-          <w:rFonts w:ascii="David" w:hAnsi="David" w:cs="David"/>
-          <w:sz w:val="24"/>
-          <w:szCs w:val="24"/>
-          <w:rtl/>
-          <w:lang w:bidi="he-IL"/>
-        </w:rPr>
-        <w:t>חוג 'ג׳ודו לילדים' מיועד לקבוצת גיל ילדים (גילאי 7–11). המפגשים מתקיימים ביום שלישי בשעות 18:00–19:00, באולם ספורט. מחיר חודשי: 230 ₪. מדריך/ה: יוסי כהן</w:t>
+        </w:rPr>
+      </w:pPr>
+      <w:r>
+        <w:rPr>
+          <w:rFonts w:ascii="David" w:hAnsi="David" w:cs="David"/>
+          <w:sz w:val="24"/>
+          <w:szCs w:val="24"/>
+          <w:rtl/>
+          <w:lang w:bidi="he-IL"/>
+        </w:rPr>
+        <w:t xml:space="preserve">חוג 'ג׳ודו לילדים' מיועד לקבוצת גיל ילדים (גילאי </w:t>
+      </w:r>
+      <w:r>
+        <w:rPr>
+          <w:rFonts w:ascii="David" w:hAnsi="David" w:cs="David"/>
+          <w:sz w:val="24"/>
+          <w:szCs w:val="24"/>
+          <w:lang w:bidi="he-IL"/>
+        </w:rPr>
+        <w:t>11</w:t>
+      </w:r>
+      <w:r>
+        <w:rPr>
+          <w:rFonts w:ascii="David" w:hAnsi="David" w:cs="David"/>
+          <w:sz w:val="24"/>
+          <w:szCs w:val="24"/>
+          <w:rtl/>
+          <w:lang w:bidi="he-IL"/>
+        </w:rPr>
+        <w:t>–</w:t>
+      </w:r>
+      <w:r>
+        <w:rPr>
+          <w:rFonts w:ascii="David" w:hAnsi="David" w:cs="David"/>
+          <w:sz w:val="24"/>
+          <w:szCs w:val="24"/>
+          <w:lang w:bidi="he-IL"/>
+        </w:rPr>
+        <w:t>7</w:t>
+      </w:r>
+      <w:r>
+        <w:rPr>
+          <w:rFonts w:ascii="David" w:hAnsi="David" w:cs="David"/>
+          <w:sz w:val="24"/>
+          <w:szCs w:val="24"/>
+          <w:rtl/>
+          <w:lang w:bidi="he-IL"/>
+        </w:rPr>
+        <w:t>). המפגשים מתקיימים ביום שלישי בשעות</w:t>
+      </w:r>
+      <w:r>
+        <w:rPr>
+          <w:rFonts w:ascii="David" w:hAnsi="David" w:cs="David"/>
+          <w:sz w:val="24"/>
+          <w:szCs w:val="24"/>
+          <w:lang w:bidi="he-IL"/>
+        </w:rPr>
+        <w:t xml:space="preserve">     </w:t>
+      </w:r>
+      <w:r>
+        <w:rPr>
+          <w:rFonts w:ascii="David" w:hAnsi="David" w:cs="David"/>
+          <w:sz w:val="24"/>
+          <w:szCs w:val="24"/>
+          <w:rtl/>
+          <w:lang w:bidi="he-IL"/>
+        </w:rPr>
+        <w:t xml:space="preserve"> </w:t>
+      </w:r>
+      <w:r>
+        <w:rPr>
+          <w:rFonts w:ascii="David" w:hAnsi="David" w:cs="David"/>
+          <w:sz w:val="24"/>
+          <w:szCs w:val="24"/>
+          <w:lang w:bidi="he-IL"/>
+        </w:rPr>
+        <w:t>19:00</w:t>
+      </w:r>
+      <w:r>
+        <w:rPr>
+          <w:rFonts w:ascii="David" w:hAnsi="David" w:cs="David"/>
+          <w:sz w:val="24"/>
+          <w:szCs w:val="24"/>
+          <w:rtl/>
+          <w:lang w:bidi="he-IL"/>
+        </w:rPr>
+        <w:t>–</w:t>
+      </w:r>
+      <w:r>
+        <w:rPr>
+          <w:rFonts w:ascii="David" w:hAnsi="David" w:cs="David"/>
+          <w:sz w:val="24"/>
+          <w:szCs w:val="24"/>
+          <w:lang w:bidi="he-IL"/>
+        </w:rPr>
+        <w:t>18:00</w:t>
+      </w:r>
+      <w:r>
+        <w:rPr>
+          <w:rFonts w:ascii="David" w:hAnsi="David" w:cs="David"/>
+          <w:sz w:val="24"/>
+          <w:szCs w:val="24"/>
+          <w:rtl/>
+          <w:lang w:bidi="he-IL"/>
+        </w:rPr>
+        <w:t>, באולם ספורט. מחיר חודשי: 230 ₪. מדריך/ה: יוסי כהן</w:t>
       </w:r>
       <w:r>
         <w:rPr>
@@ -1432,17 +2561,6 @@
         </w:rPr>
         <w:t>.</w:t>
       </w:r>
-    </w:p>
-    <w:p>
-      <w:pPr>
-        <w:bidi/>
-        <w:spacing w:afterLines="120" w:after="288" w:line="360" w:lineRule="auto"/>
-        <w:rPr>
-          <w:rFonts w:ascii="David" w:hAnsi="David" w:cs="David"/>
-          <w:sz w:val="24"/>
-          <w:szCs w:val="24"/>
-        </w:rPr>
-      </w:pPr>
     </w:p>
     <w:p>
       <w:pPr>
@@ -1487,7 +2605,83 @@
           <w:rtl/>
           <w:lang w:bidi="he-IL"/>
         </w:rPr>
-        <w:t>חוג 'הגנה עצמית לנערות' מיועד לקבוצת גיל נוער (גילאי 12–17). המפגשים מתקיימים ביום חמישי בשעות 17:30–18:30, באולם ספורט. מחיר חודשי: 220 ₪. מדריך/ה: דניאל פרץ</w:t>
+        <w:t xml:space="preserve">חוג 'הגנה עצמית לנערות' מיועד לקבוצת גיל נוער (גילאי </w:t>
+      </w:r>
+      <w:r>
+        <w:rPr>
+          <w:rFonts w:ascii="David" w:hAnsi="David" w:cs="David"/>
+          <w:sz w:val="24"/>
+          <w:szCs w:val="24"/>
+          <w:lang w:bidi="he-IL"/>
+        </w:rPr>
+        <w:t>17</w:t>
+      </w:r>
+      <w:r>
+        <w:rPr>
+          <w:rFonts w:ascii="David" w:hAnsi="David" w:cs="David"/>
+          <w:sz w:val="24"/>
+          <w:szCs w:val="24"/>
+          <w:rtl/>
+          <w:lang w:bidi="he-IL"/>
+        </w:rPr>
+        <w:t>–</w:t>
+      </w:r>
+      <w:r>
+        <w:rPr>
+          <w:rFonts w:ascii="David" w:hAnsi="David" w:cs="David"/>
+          <w:sz w:val="24"/>
+          <w:szCs w:val="24"/>
+          <w:lang w:bidi="he-IL"/>
+        </w:rPr>
+        <w:t>12</w:t>
+      </w:r>
+      <w:r>
+        <w:rPr>
+          <w:rFonts w:ascii="David" w:hAnsi="David" w:cs="David"/>
+          <w:sz w:val="24"/>
+          <w:szCs w:val="24"/>
+          <w:rtl/>
+          <w:lang w:bidi="he-IL"/>
+        </w:rPr>
+        <w:t xml:space="preserve">). המפגשים מתקיימים ביום חמישי בשעות </w:t>
+      </w:r>
+      <w:r>
+        <w:rPr>
+          <w:rFonts w:ascii="David" w:hAnsi="David" w:cs="David"/>
+          <w:sz w:val="24"/>
+          <w:szCs w:val="24"/>
+          <w:lang w:bidi="he-IL"/>
+        </w:rPr>
+        <w:t>18:30</w:t>
+      </w:r>
+      <w:r>
+        <w:rPr>
+          <w:rFonts w:ascii="David" w:hAnsi="David" w:cs="David"/>
+          <w:sz w:val="24"/>
+          <w:szCs w:val="24"/>
+          <w:rtl/>
+          <w:lang w:bidi="he-IL"/>
+        </w:rPr>
+        <w:t>–</w:t>
+      </w:r>
+      <w:r>
+        <w:rPr>
+          <w:rFonts w:ascii="David" w:hAnsi="David" w:cs="David"/>
+          <w:sz w:val="24"/>
+          <w:szCs w:val="24"/>
+          <w:lang w:bidi="he-IL"/>
+        </w:rPr>
+        <w:t>17:30</w:t>
+      </w:r>
+      <w:r>
+        <w:rPr>
+          <w:rFonts w:ascii="David" w:hAnsi="David" w:cs="David"/>
+          <w:sz w:val="24"/>
+          <w:szCs w:val="24"/>
+          <w:rtl/>
+          <w:lang w:bidi="he-IL"/>
+        </w:rPr>
+        <w:t>, באולם ספורט. מחיר חודשי: 220 ₪. מדריך/ה: דניאל פרץ</w:t>
       </w:r>
       <w:r>
         <w:rPr>
@@ -1518,6 +2712,7 @@
           <w:rtl/>
           <w:lang w:bidi="he-IL"/>
         </w:rPr>
+        <w:lastRenderedPageBreak/>
         <w:t>התעמלות לגיל הזהב</w:t>
       </w:r>
     </w:p>
@@ -1539,7 +2734,83 @@
           <w:rtl/>
           <w:lang w:bidi="he-IL"/>
         </w:rPr>
-        <w:t>חוג 'התעמלות לגיל הזהב' מיועד לקבוצת גיל גיל הזהב (גילאי 60–99). המפגשים מתקיימים ביום שני בשעות 09:00–10:00, באולם ספורט. מחיר חודשי: 100 ₪. מדריך/ה: רונית אברהם</w:t>
+        <w:t xml:space="preserve">חוג 'התעמלות לגיל הזהב' מיועד לקבוצת גיל גיל הזהב (גילאי </w:t>
+      </w:r>
+      <w:r>
+        <w:rPr>
+          <w:rFonts w:ascii="David" w:hAnsi="David" w:cs="David"/>
+          <w:sz w:val="24"/>
+          <w:szCs w:val="24"/>
+          <w:lang w:bidi="he-IL"/>
+        </w:rPr>
+        <w:t>99</w:t>
+      </w:r>
+      <w:r>
+        <w:rPr>
+          <w:rFonts w:ascii="David" w:hAnsi="David" w:cs="David"/>
+          <w:sz w:val="24"/>
+          <w:szCs w:val="24"/>
+          <w:rtl/>
+          <w:lang w:bidi="he-IL"/>
+        </w:rPr>
+        <w:t>–</w:t>
+      </w:r>
+      <w:r>
+        <w:rPr>
+          <w:rFonts w:ascii="David" w:hAnsi="David" w:cs="David"/>
+          <w:sz w:val="24"/>
+          <w:szCs w:val="24"/>
+          <w:lang w:bidi="he-IL"/>
+        </w:rPr>
+        <w:t>60</w:t>
+      </w:r>
+      <w:r>
+        <w:rPr>
+          <w:rFonts w:ascii="David" w:hAnsi="David" w:cs="David"/>
+          <w:sz w:val="24"/>
+          <w:szCs w:val="24"/>
+          <w:rtl/>
+          <w:lang w:bidi="he-IL"/>
+        </w:rPr>
+        <w:t xml:space="preserve">). המפגשים מתקיימים ביום שני בשעות </w:t>
+      </w:r>
+      <w:r>
+        <w:rPr>
+          <w:rFonts w:ascii="David" w:hAnsi="David" w:cs="David"/>
+          <w:sz w:val="24"/>
+          <w:szCs w:val="24"/>
+          <w:lang w:bidi="he-IL"/>
+        </w:rPr>
+        <w:t>10:00</w:t>
+      </w:r>
+      <w:r>
+        <w:rPr>
+          <w:rFonts w:ascii="David" w:hAnsi="David" w:cs="David"/>
+          <w:sz w:val="24"/>
+          <w:szCs w:val="24"/>
+          <w:rtl/>
+          <w:lang w:bidi="he-IL"/>
+        </w:rPr>
+        <w:t>–</w:t>
+      </w:r>
+      <w:r>
+        <w:rPr>
+          <w:rFonts w:ascii="David" w:hAnsi="David" w:cs="David"/>
+          <w:sz w:val="24"/>
+          <w:szCs w:val="24"/>
+          <w:lang w:bidi="he-IL"/>
+        </w:rPr>
+        <w:t>9:00</w:t>
+      </w:r>
+      <w:r>
+        <w:rPr>
+          <w:rFonts w:ascii="David" w:hAnsi="David" w:cs="David"/>
+          <w:sz w:val="24"/>
+          <w:szCs w:val="24"/>
+          <w:rtl/>
+          <w:lang w:bidi="he-IL"/>
+        </w:rPr>
+        <w:t>, באולם ספורט. מחיר חודשי: 100 ₪. מדריך/ה: רונית אברהם</w:t>
       </w:r>
       <w:r>
         <w:rPr>
@@ -1591,7 +2862,83 @@
           <w:rtl/>
           <w:lang w:bidi="he-IL"/>
         </w:rPr>
-        <w:t>חוג 'יוגה למבוגרים' מיועד לקבוצת גיל מבוגרים (גילאי 18–65). המפגשים מתקיימים ביום רביעי בשעות 19:00–20:00, באולם תנועה. מחיר חודשי: 240 ₪. מדריך/ה: רונית אברהם</w:t>
+        <w:t xml:space="preserve">חוג 'יוגה למבוגרים' מיועד לקבוצת גיל מבוגרים (גילאי </w:t>
+      </w:r>
+      <w:r>
+        <w:rPr>
+          <w:rFonts w:ascii="David" w:hAnsi="David" w:cs="David"/>
+          <w:sz w:val="24"/>
+          <w:szCs w:val="24"/>
+          <w:lang w:bidi="he-IL"/>
+        </w:rPr>
+        <w:t>65</w:t>
+      </w:r>
+      <w:r>
+        <w:rPr>
+          <w:rFonts w:ascii="David" w:hAnsi="David" w:cs="David"/>
+          <w:sz w:val="24"/>
+          <w:szCs w:val="24"/>
+          <w:rtl/>
+          <w:lang w:bidi="he-IL"/>
+        </w:rPr>
+        <w:t>–</w:t>
+      </w:r>
+      <w:r>
+        <w:rPr>
+          <w:rFonts w:ascii="David" w:hAnsi="David" w:cs="David"/>
+          <w:sz w:val="24"/>
+          <w:szCs w:val="24"/>
+          <w:lang w:bidi="he-IL"/>
+        </w:rPr>
+        <w:t>18</w:t>
+      </w:r>
+      <w:r>
+        <w:rPr>
+          <w:rFonts w:ascii="David" w:hAnsi="David" w:cs="David"/>
+          <w:sz w:val="24"/>
+          <w:szCs w:val="24"/>
+          <w:rtl/>
+          <w:lang w:bidi="he-IL"/>
+        </w:rPr>
+        <w:t xml:space="preserve">). המפגשים מתקיימים ביום רביעי בשעות </w:t>
+      </w:r>
+      <w:r>
+        <w:rPr>
+          <w:rFonts w:ascii="David" w:hAnsi="David" w:cs="David"/>
+          <w:sz w:val="24"/>
+          <w:szCs w:val="24"/>
+          <w:lang w:bidi="he-IL"/>
+        </w:rPr>
+        <w:t>20:00</w:t>
+      </w:r>
+      <w:r>
+        <w:rPr>
+          <w:rFonts w:ascii="David" w:hAnsi="David" w:cs="David"/>
+          <w:sz w:val="24"/>
+          <w:szCs w:val="24"/>
+          <w:rtl/>
+          <w:lang w:bidi="he-IL"/>
+        </w:rPr>
+        <w:t>–</w:t>
+      </w:r>
+      <w:r>
+        <w:rPr>
+          <w:rFonts w:ascii="David" w:hAnsi="David" w:cs="David"/>
+          <w:sz w:val="24"/>
+          <w:szCs w:val="24"/>
+          <w:lang w:bidi="he-IL"/>
+        </w:rPr>
+        <w:t>19:00</w:t>
+      </w:r>
+      <w:r>
+        <w:rPr>
+          <w:rFonts w:ascii="David" w:hAnsi="David" w:cs="David"/>
+          <w:sz w:val="24"/>
+          <w:szCs w:val="24"/>
+          <w:rtl/>
+          <w:lang w:bidi="he-IL"/>
+        </w:rPr>
+        <w:t>, באולם תנועה. מחיר חודשי: 240 ₪. מדריך/ה: רונית אברהם</w:t>
       </w:r>
       <w:r>
         <w:rPr>
@@ -1643,7 +2990,102 @@
           <w:rtl/>
           <w:lang w:bidi="he-IL"/>
         </w:rPr>
-        <w:t>חוג 'כדורגל לילדים' מיועד לקבוצת גיל ילדים (גילאי 7–11). המפגשים מתקיימים ביום שלישי בשעות 16:30–17:30, במגרש חיצוני. מחיר חודשי: 200 ₪. מדריך/ה: יוסי כהן</w:t>
+        <w:t xml:space="preserve">חוג 'כדורגל לילדים' מיועד לקבוצת גיל ילדים (גילאי </w:t>
+      </w:r>
+      <w:r>
+        <w:rPr>
+          <w:rFonts w:ascii="David" w:hAnsi="David" w:cs="David"/>
+          <w:sz w:val="24"/>
+          <w:szCs w:val="24"/>
+          <w:lang w:bidi="he-IL"/>
+        </w:rPr>
+        <w:t>11</w:t>
+      </w:r>
+      <w:r>
+        <w:rPr>
+          <w:rFonts w:ascii="David" w:hAnsi="David" w:cs="David"/>
+          <w:sz w:val="24"/>
+          <w:szCs w:val="24"/>
+          <w:rtl/>
+          <w:lang w:bidi="he-IL"/>
+        </w:rPr>
+        <w:t>–</w:t>
+      </w:r>
+      <w:r>
+        <w:rPr>
+          <w:rFonts w:ascii="David" w:hAnsi="David" w:cs="David"/>
+          <w:sz w:val="24"/>
+          <w:szCs w:val="24"/>
+          <w:lang w:bidi="he-IL"/>
+        </w:rPr>
+        <w:t>7</w:t>
+      </w:r>
+      <w:r>
+        <w:rPr>
+          <w:rFonts w:ascii="David" w:hAnsi="David" w:cs="David"/>
+          <w:sz w:val="24"/>
+          <w:szCs w:val="24"/>
+          <w:rtl/>
+          <w:lang w:bidi="he-IL"/>
+        </w:rPr>
+        <w:t>). המפגשים מתקיימים ביום שלישי בשעות</w:t>
+      </w:r>
+      <w:r>
+        <w:rPr>
+          <w:rFonts w:ascii="David" w:hAnsi="David" w:cs="David"/>
+          <w:sz w:val="24"/>
+          <w:szCs w:val="24"/>
+          <w:lang w:bidi="he-IL"/>
+        </w:rPr>
+        <w:t xml:space="preserve"> </w:t>
+      </w:r>
+      <w:r>
+        <w:rPr>
+          <w:rFonts w:ascii="David" w:hAnsi="David" w:cs="David"/>
+          <w:sz w:val="24"/>
+          <w:szCs w:val="24"/>
+          <w:rtl/>
+          <w:lang w:bidi="he-IL"/>
+        </w:rPr>
+        <w:t xml:space="preserve"> </w:t>
+      </w:r>
+      <w:r>
+        <w:rPr>
+          <w:rFonts w:ascii="David" w:hAnsi="David" w:cs="David"/>
+          <w:sz w:val="24"/>
+          <w:szCs w:val="24"/>
+          <w:lang w:bidi="he-IL"/>
+        </w:rPr>
+        <w:t>17:30</w:t>
+      </w:r>
+      <w:r>
+        <w:rPr>
+          <w:rFonts w:ascii="David" w:hAnsi="David" w:cs="David"/>
+          <w:sz w:val="24"/>
+          <w:szCs w:val="24"/>
+          <w:rtl/>
+          <w:lang w:bidi="he-IL"/>
+        </w:rPr>
+        <w:t>–</w:t>
+      </w:r>
+      <w:r>
+        <w:rPr>
+          <w:rFonts w:ascii="David" w:hAnsi="David" w:cs="David"/>
+          <w:sz w:val="24"/>
+          <w:szCs w:val="24"/>
+          <w:lang w:bidi="he-IL"/>
+        </w:rPr>
+        <w:t>16:30</w:t>
+      </w:r>
+      <w:r>
+        <w:rPr>
+          <w:rFonts w:ascii="David" w:hAnsi="David" w:cs="David"/>
+          <w:sz w:val="24"/>
+          <w:szCs w:val="24"/>
+          <w:rtl/>
+          <w:lang w:bidi="he-IL"/>
+        </w:rPr>
+        <w:t>, במגרש חיצוני. מחיר חודשי: 200 ₪. מדריך/ה: יוסי כהן</w:t>
       </w:r>
       <w:r>
         <w:rPr>
@@ -1695,7 +3137,102 @@
           <w:rtl/>
           <w:lang w:bidi="he-IL"/>
         </w:rPr>
-        <w:t>חוג 'כדורסל לנוער' מיועד לקבוצת גיל נוער (גילאי 12–16). המפגשים מתקיימים ביום רביעי בשעות 18:30–19:30, באולם ספורט. מחיר חודשי: 220 ₪. מדריך/ה: יוסי כהן</w:t>
+        <w:t xml:space="preserve">חוג 'כדורסל לנוער' מיועד לקבוצת גיל נוער (גילאי </w:t>
+      </w:r>
+      <w:r>
+        <w:rPr>
+          <w:rFonts w:ascii="David" w:hAnsi="David" w:cs="David"/>
+          <w:sz w:val="24"/>
+          <w:szCs w:val="24"/>
+          <w:lang w:bidi="he-IL"/>
+        </w:rPr>
+        <w:t>16</w:t>
+      </w:r>
+      <w:r>
+        <w:rPr>
+          <w:rFonts w:ascii="David" w:hAnsi="David" w:cs="David"/>
+          <w:sz w:val="24"/>
+          <w:szCs w:val="24"/>
+          <w:rtl/>
+          <w:lang w:bidi="he-IL"/>
+        </w:rPr>
+        <w:t>–</w:t>
+      </w:r>
+      <w:r>
+        <w:rPr>
+          <w:rFonts w:ascii="David" w:hAnsi="David" w:cs="David"/>
+          <w:sz w:val="24"/>
+          <w:szCs w:val="24"/>
+          <w:lang w:bidi="he-IL"/>
+        </w:rPr>
+        <w:t>12</w:t>
+      </w:r>
+      <w:r>
+        <w:rPr>
+          <w:rFonts w:ascii="David" w:hAnsi="David" w:cs="David"/>
+          <w:sz w:val="24"/>
+          <w:szCs w:val="24"/>
+          <w:rtl/>
+          <w:lang w:bidi="he-IL"/>
+        </w:rPr>
+        <w:t>). המפגשים מתקיימים ביום רביעי בשעות</w:t>
+      </w:r>
+      <w:r>
+        <w:rPr>
+          <w:rFonts w:ascii="David" w:hAnsi="David" w:cs="David"/>
+          <w:sz w:val="24"/>
+          <w:szCs w:val="24"/>
+          <w:lang w:bidi="he-IL"/>
+        </w:rPr>
+        <w:t xml:space="preserve">     </w:t>
+      </w:r>
+      <w:r>
+        <w:rPr>
+          <w:rFonts w:ascii="David" w:hAnsi="David" w:cs="David"/>
+          <w:sz w:val="24"/>
+          <w:szCs w:val="24"/>
+          <w:rtl/>
+          <w:lang w:bidi="he-IL"/>
+        </w:rPr>
+        <w:t xml:space="preserve"> </w:t>
+      </w:r>
+      <w:r>
+        <w:rPr>
+          <w:rFonts w:ascii="David" w:hAnsi="David" w:cs="David"/>
+          <w:sz w:val="24"/>
+          <w:szCs w:val="24"/>
+          <w:lang w:bidi="he-IL"/>
+        </w:rPr>
+        <w:t>19:30</w:t>
+      </w:r>
+      <w:r>
+        <w:rPr>
+          <w:rFonts w:ascii="David" w:hAnsi="David" w:cs="David"/>
+          <w:sz w:val="24"/>
+          <w:szCs w:val="24"/>
+          <w:rtl/>
+          <w:lang w:bidi="he-IL"/>
+        </w:rPr>
+        <w:t>–</w:t>
+      </w:r>
+      <w:r>
+        <w:rPr>
+          <w:rFonts w:ascii="David" w:hAnsi="David" w:cs="David"/>
+          <w:sz w:val="24"/>
+          <w:szCs w:val="24"/>
+          <w:lang w:bidi="he-IL"/>
+        </w:rPr>
+        <w:t>18:30</w:t>
+      </w:r>
+      <w:r>
+        <w:rPr>
+          <w:rFonts w:ascii="David" w:hAnsi="David" w:cs="David"/>
+          <w:sz w:val="24"/>
+          <w:szCs w:val="24"/>
+          <w:rtl/>
+          <w:lang w:bidi="he-IL"/>
+        </w:rPr>
+        <w:t>, באולם ספורט. מחיר חודשי: 220 ₪. מדריך/ה: יוסי כהן</w:t>
       </w:r>
       <w:r>
         <w:rPr>
@@ -1747,7 +3284,83 @@
           <w:rtl/>
           <w:lang w:bidi="he-IL"/>
         </w:rPr>
-        <w:t>חוג 'מחול מודרני לילדות' מיועד לקבוצת גיל ילדים (גילאי 6–10). המפגשים מתקיימים ביום חמישי בשעות 16:00–17:00, באולם תנועה. מחיר חודשי: 210 ₪. מדריך/ה: שרית דיין</w:t>
+        <w:t xml:space="preserve">חוג 'מחול מודרני לילדות' מיועד לקבוצת גיל ילדים (גילאי </w:t>
+      </w:r>
+      <w:r>
+        <w:rPr>
+          <w:rFonts w:ascii="David" w:hAnsi="David" w:cs="David"/>
+          <w:sz w:val="24"/>
+          <w:szCs w:val="24"/>
+          <w:lang w:bidi="he-IL"/>
+        </w:rPr>
+        <w:t>10</w:t>
+      </w:r>
+      <w:r>
+        <w:rPr>
+          <w:rFonts w:ascii="David" w:hAnsi="David" w:cs="David"/>
+          <w:sz w:val="24"/>
+          <w:szCs w:val="24"/>
+          <w:rtl/>
+          <w:lang w:bidi="he-IL"/>
+        </w:rPr>
+        <w:t>–</w:t>
+      </w:r>
+      <w:r>
+        <w:rPr>
+          <w:rFonts w:ascii="David" w:hAnsi="David" w:cs="David"/>
+          <w:sz w:val="24"/>
+          <w:szCs w:val="24"/>
+          <w:lang w:bidi="he-IL"/>
+        </w:rPr>
+        <w:t>6</w:t>
+      </w:r>
+      <w:r>
+        <w:rPr>
+          <w:rFonts w:ascii="David" w:hAnsi="David" w:cs="David"/>
+          <w:sz w:val="24"/>
+          <w:szCs w:val="24"/>
+          <w:rtl/>
+          <w:lang w:bidi="he-IL"/>
+        </w:rPr>
+        <w:t xml:space="preserve">). המפגשים מתקיימים ביום חמישי בשעות </w:t>
+      </w:r>
+      <w:r>
+        <w:rPr>
+          <w:rFonts w:ascii="David" w:hAnsi="David" w:cs="David"/>
+          <w:sz w:val="24"/>
+          <w:szCs w:val="24"/>
+          <w:lang w:bidi="he-IL"/>
+        </w:rPr>
+        <w:t>17:00</w:t>
+      </w:r>
+      <w:r>
+        <w:rPr>
+          <w:rFonts w:ascii="David" w:hAnsi="David" w:cs="David"/>
+          <w:sz w:val="24"/>
+          <w:szCs w:val="24"/>
+          <w:rtl/>
+          <w:lang w:bidi="he-IL"/>
+        </w:rPr>
+        <w:t>–</w:t>
+      </w:r>
+      <w:r>
+        <w:rPr>
+          <w:rFonts w:ascii="David" w:hAnsi="David" w:cs="David"/>
+          <w:sz w:val="24"/>
+          <w:szCs w:val="24"/>
+          <w:lang w:bidi="he-IL"/>
+        </w:rPr>
+        <w:t>16:00</w:t>
+      </w:r>
+      <w:r>
+        <w:rPr>
+          <w:rFonts w:ascii="David" w:hAnsi="David" w:cs="David"/>
+          <w:sz w:val="24"/>
+          <w:szCs w:val="24"/>
+          <w:rtl/>
+          <w:lang w:bidi="he-IL"/>
+        </w:rPr>
+        <w:t>, באולם תנועה. מחיר חודשי: 210 ₪. מדריך/ה: שרית דיין</w:t>
       </w:r>
       <w:r>
         <w:rPr>
@@ -1799,7 +3412,83 @@
           <w:rtl/>
           <w:lang w:bidi="he-IL"/>
         </w:rPr>
-        <w:t>חוג 'פילאטיס לנשים' מיועד לקבוצת גיל מבוגרים (גילאי 18–65). המפגשים מתקיימים ביום שני בשעות 19:30–20:30, באולם תנועה. מחיר חודשי: 250 ₪. מדריך/ה: רונית אברהם</w:t>
+        <w:t xml:space="preserve">חוג 'פילאטיס לנשים' מיועד לקבוצת גיל מבוגרים (גילאי </w:t>
+      </w:r>
+      <w:r>
+        <w:rPr>
+          <w:rFonts w:ascii="David" w:hAnsi="David" w:cs="David"/>
+          <w:sz w:val="24"/>
+          <w:szCs w:val="24"/>
+          <w:lang w:bidi="he-IL"/>
+        </w:rPr>
+        <w:t>65</w:t>
+      </w:r>
+      <w:r>
+        <w:rPr>
+          <w:rFonts w:ascii="David" w:hAnsi="David" w:cs="David"/>
+          <w:sz w:val="24"/>
+          <w:szCs w:val="24"/>
+          <w:rtl/>
+          <w:lang w:bidi="he-IL"/>
+        </w:rPr>
+        <w:t>–</w:t>
+      </w:r>
+      <w:r>
+        <w:rPr>
+          <w:rFonts w:ascii="David" w:hAnsi="David" w:cs="David"/>
+          <w:sz w:val="24"/>
+          <w:szCs w:val="24"/>
+          <w:lang w:bidi="he-IL"/>
+        </w:rPr>
+        <w:t>18</w:t>
+      </w:r>
+      <w:r>
+        <w:rPr>
+          <w:rFonts w:ascii="David" w:hAnsi="David" w:cs="David"/>
+          <w:sz w:val="24"/>
+          <w:szCs w:val="24"/>
+          <w:rtl/>
+          <w:lang w:bidi="he-IL"/>
+        </w:rPr>
+        <w:t xml:space="preserve">). המפגשים מתקיימים ביום שני בשעות </w:t>
+      </w:r>
+      <w:r>
+        <w:rPr>
+          <w:rFonts w:ascii="David" w:hAnsi="David" w:cs="David"/>
+          <w:sz w:val="24"/>
+          <w:szCs w:val="24"/>
+          <w:lang w:bidi="he-IL"/>
+        </w:rPr>
+        <w:t>20:30</w:t>
+      </w:r>
+      <w:r>
+        <w:rPr>
+          <w:rFonts w:ascii="David" w:hAnsi="David" w:cs="David"/>
+          <w:sz w:val="24"/>
+          <w:szCs w:val="24"/>
+          <w:rtl/>
+          <w:lang w:bidi="he-IL"/>
+        </w:rPr>
+        <w:t>–</w:t>
+      </w:r>
+      <w:r>
+        <w:rPr>
+          <w:rFonts w:ascii="David" w:hAnsi="David" w:cs="David"/>
+          <w:sz w:val="24"/>
+          <w:szCs w:val="24"/>
+          <w:lang w:bidi="he-IL"/>
+        </w:rPr>
+        <w:t>19:30</w:t>
+      </w:r>
+      <w:r>
+        <w:rPr>
+          <w:rFonts w:ascii="David" w:hAnsi="David" w:cs="David"/>
+          <w:sz w:val="24"/>
+          <w:szCs w:val="24"/>
+          <w:rtl/>
+          <w:lang w:bidi="he-IL"/>
+        </w:rPr>
+        <w:t>, באולם תנועה. מחיר חודשי: 250 ₪. מדריך/ה: רונית אברהם</w:t>
       </w:r>
       <w:r>
         <w:rPr>
@@ -1853,7 +3542,83 @@
           <w:rtl/>
           <w:lang w:bidi="he-IL"/>
         </w:rPr>
-        <w:t>חוג 'קפוארה לילדים' מיועד לקבוצת גיל ילדים (גילאי 8–12). המפגשים מתקיימים ביום שלישי בשעות 17:45–18:45, באולם ספורט. מחיר חודשי: 210 ₪. מדריך/ה: דניאל פרץ</w:t>
+        <w:t xml:space="preserve">חוג 'קפוארה לילדים' מיועד לקבוצת גיל ילדים (גילאי </w:t>
+      </w:r>
+      <w:r>
+        <w:rPr>
+          <w:rFonts w:ascii="David" w:hAnsi="David" w:cs="David"/>
+          <w:sz w:val="24"/>
+          <w:szCs w:val="24"/>
+          <w:lang w:bidi="he-IL"/>
+        </w:rPr>
+        <w:t>12</w:t>
+      </w:r>
+      <w:r>
+        <w:rPr>
+          <w:rFonts w:ascii="David" w:hAnsi="David" w:cs="David"/>
+          <w:sz w:val="24"/>
+          <w:szCs w:val="24"/>
+          <w:rtl/>
+          <w:lang w:bidi="he-IL"/>
+        </w:rPr>
+        <w:t>–</w:t>
+      </w:r>
+      <w:r>
+        <w:rPr>
+          <w:rFonts w:ascii="David" w:hAnsi="David" w:cs="David"/>
+          <w:sz w:val="24"/>
+          <w:szCs w:val="24"/>
+          <w:lang w:bidi="he-IL"/>
+        </w:rPr>
+        <w:t>8</w:t>
+      </w:r>
+      <w:r>
+        <w:rPr>
+          <w:rFonts w:ascii="David" w:hAnsi="David" w:cs="David"/>
+          <w:sz w:val="24"/>
+          <w:szCs w:val="24"/>
+          <w:rtl/>
+          <w:lang w:bidi="he-IL"/>
+        </w:rPr>
+        <w:t xml:space="preserve">). המפגשים מתקיימים ביום שלישי בשעות </w:t>
+      </w:r>
+      <w:r>
+        <w:rPr>
+          <w:rFonts w:ascii="David" w:hAnsi="David" w:cs="David"/>
+          <w:sz w:val="24"/>
+          <w:szCs w:val="24"/>
+          <w:lang w:bidi="he-IL"/>
+        </w:rPr>
+        <w:t>18:45</w:t>
+      </w:r>
+      <w:r>
+        <w:rPr>
+          <w:rFonts w:ascii="David" w:hAnsi="David" w:cs="David"/>
+          <w:sz w:val="24"/>
+          <w:szCs w:val="24"/>
+          <w:rtl/>
+          <w:lang w:bidi="he-IL"/>
+        </w:rPr>
+        <w:t>–</w:t>
+      </w:r>
+      <w:r>
+        <w:rPr>
+          <w:rFonts w:ascii="David" w:hAnsi="David" w:cs="David"/>
+          <w:sz w:val="24"/>
+          <w:szCs w:val="24"/>
+          <w:lang w:bidi="he-IL"/>
+        </w:rPr>
+        <w:t>17:45</w:t>
+      </w:r>
+      <w:r>
+        <w:rPr>
+          <w:rFonts w:ascii="David" w:hAnsi="David" w:cs="David"/>
+          <w:sz w:val="24"/>
+          <w:szCs w:val="24"/>
+          <w:rtl/>
+          <w:lang w:bidi="he-IL"/>
+        </w:rPr>
+        <w:t>, באולם ספורט. מחיר חודשי: 210 ₪. מדריך/ה: דניאל פרץ</w:t>
       </w:r>
       <w:r>
         <w:rPr>
@@ -1892,20 +3657,98 @@
         <w:bidi/>
         <w:spacing w:afterLines="120" w:after="288" w:line="360" w:lineRule="auto"/>
         <w:rPr>
-          <w:rFonts w:ascii="David" w:hAnsi="David" w:cs="David"/>
-          <w:sz w:val="24"/>
-          <w:szCs w:val="24"/>
-        </w:rPr>
-      </w:pPr>
-      <w:r>
-        <w:rPr>
-          <w:rFonts w:ascii="David" w:hAnsi="David" w:cs="David"/>
-          <w:sz w:val="24"/>
-          <w:szCs w:val="24"/>
-          <w:rtl/>
-          <w:lang w:bidi="he-IL"/>
-        </w:rPr>
-        <w:t>חוג 'תנועה לגיל הרך' מיועד לקבוצת גיל גיל הרך (גילאי 3–5). המפגשים מתקיימים ביום רביעי בשעות 16:00–16:45, באולם תנועה. מחיר חודשי: 150 ₪. מדריך/ה: רונית אברהם</w:t>
+          <w:rFonts w:ascii="David" w:hAnsi="David" w:hint="cs"/>
+          <w:sz w:val="24"/>
+          <w:szCs w:val="24"/>
+          <w:rtl/>
+          <w:lang w:bidi="ar-EG"/>
+        </w:rPr>
+      </w:pPr>
+      <w:r>
+        <w:rPr>
+          <w:rFonts w:ascii="David" w:hAnsi="David" w:cs="David"/>
+          <w:sz w:val="24"/>
+          <w:szCs w:val="24"/>
+          <w:rtl/>
+          <w:lang w:bidi="he-IL"/>
+        </w:rPr>
+        <w:t xml:space="preserve">חוג 'תנועה לגיל הרך' מיועד לקבוצת גיל גיל הרך (גילאי </w:t>
+      </w:r>
+      <w:r>
+        <w:rPr>
+          <w:rFonts w:ascii="David" w:hAnsi="David" w:cs="David"/>
+          <w:sz w:val="24"/>
+          <w:szCs w:val="24"/>
+          <w:lang w:bidi="he-IL"/>
+        </w:rPr>
+        <w:t>5</w:t>
+      </w:r>
+      <w:r>
+        <w:rPr>
+          <w:rFonts w:ascii="David" w:hAnsi="David" w:cs="David"/>
+          <w:sz w:val="24"/>
+          <w:szCs w:val="24"/>
+          <w:rtl/>
+          <w:lang w:bidi="he-IL"/>
+        </w:rPr>
+        <w:t>–</w:t>
+      </w:r>
+      <w:r>
+        <w:rPr>
+          <w:rFonts w:ascii="David" w:hAnsi="David" w:cs="David"/>
+          <w:sz w:val="24"/>
+          <w:szCs w:val="24"/>
+          <w:lang w:bidi="he-IL"/>
+        </w:rPr>
+        <w:t>3</w:t>
+      </w:r>
+      <w:r>
+        <w:rPr>
+          <w:rFonts w:ascii="David" w:hAnsi="David" w:cs="David"/>
+          <w:sz w:val="24"/>
+          <w:szCs w:val="24"/>
+          <w:rtl/>
+          <w:lang w:bidi="he-IL"/>
+        </w:rPr>
+        <w:t xml:space="preserve">). המפגשים מתקיימים ביום רביעי בשעות </w:t>
+      </w:r>
+      <w:r>
+        <w:rPr>
+          <w:rFonts w:ascii="David" w:hAnsi="David" w:cs="David"/>
+          <w:sz w:val="24"/>
+          <w:szCs w:val="24"/>
+          <w:lang w:bidi="he-IL"/>
+        </w:rPr>
+        <w:t>16:45</w:t>
+      </w:r>
+      <w:r>
+        <w:rPr>
+          <w:rFonts w:ascii="David" w:hAnsi="David" w:cs="David"/>
+          <w:sz w:val="24"/>
+          <w:szCs w:val="24"/>
+          <w:rtl/>
+          <w:lang w:bidi="he-IL"/>
+        </w:rPr>
+        <w:t>–</w:t>
+      </w:r>
+      <w:r>
+        <w:rPr>
+          <w:rFonts w:ascii="David" w:hAnsi="David" w:cs="David"/>
+          <w:sz w:val="24"/>
+          <w:szCs w:val="24"/>
+          <w:lang w:bidi="he-IL"/>
+        </w:rPr>
+        <w:t>16:00</w:t>
+      </w:r>
+      <w:r>
+        <w:rPr>
+          <w:rFonts w:ascii="David" w:hAnsi="David" w:cs="David"/>
+          <w:sz w:val="24"/>
+          <w:szCs w:val="24"/>
+          <w:rtl/>
+          <w:lang w:bidi="he-IL"/>
+        </w:rPr>
+        <w:t>, באולם תנועה. מחיר חודשי: 150 ₪. מדריך/ה: רונית אברהם</w:t>
       </w:r>
       <w:r>
         <w:rPr>
@@ -1915,28 +3758,6 @@
         </w:rPr>
         <w:t>.</w:t>
       </w:r>
-    </w:p>
-    <w:p>
-      <w:pPr>
-        <w:bidi/>
-        <w:spacing w:afterLines="120" w:after="288" w:line="360" w:lineRule="auto"/>
-        <w:rPr>
-          <w:rFonts w:ascii="David" w:hAnsi="David" w:cs="David"/>
-          <w:sz w:val="24"/>
-          <w:szCs w:val="24"/>
-        </w:rPr>
-      </w:pPr>
-    </w:p>
-    <w:p>
-      <w:pPr>
-        <w:bidi/>
-        <w:spacing w:afterLines="120" w:after="288" w:line="360" w:lineRule="auto"/>
-        <w:rPr>
-          <w:rFonts w:ascii="David" w:hAnsi="David" w:cs="David"/>
-          <w:sz w:val="24"/>
-          <w:szCs w:val="24"/>
-        </w:rPr>
-      </w:pPr>
     </w:p>
     <w:p>
       <w:pPr>
@@ -2033,7 +3854,83 @@
           <w:rtl/>
           <w:lang w:bidi="he-IL"/>
         </w:rPr>
-        <w:t>חוג 'בישול בריא לנוער' מיועד לקבוצת גיל נוער (גילאי 13–17). המפגשים מתקיימים ביום רביעי בשעות 17:00–18:30, במטבח קהילתי. מחיר חודשי: 190 ₪. מדריך/ה: תמר ניסים</w:t>
+        <w:t xml:space="preserve">חוג 'בישול בריא לנוער' מיועד לקבוצת גיל נוער (גילאי </w:t>
+      </w:r>
+      <w:r>
+        <w:rPr>
+          <w:rFonts w:ascii="David" w:hAnsi="David" w:cs="David"/>
+          <w:sz w:val="24"/>
+          <w:szCs w:val="24"/>
+          <w:lang w:bidi="he-IL"/>
+        </w:rPr>
+        <w:t>17</w:t>
+      </w:r>
+      <w:r>
+        <w:rPr>
+          <w:rFonts w:ascii="David" w:hAnsi="David" w:cs="David"/>
+          <w:sz w:val="24"/>
+          <w:szCs w:val="24"/>
+          <w:rtl/>
+          <w:lang w:bidi="he-IL"/>
+        </w:rPr>
+        <w:t>–</w:t>
+      </w:r>
+      <w:r>
+        <w:rPr>
+          <w:rFonts w:ascii="David" w:hAnsi="David" w:cs="David"/>
+          <w:sz w:val="24"/>
+          <w:szCs w:val="24"/>
+          <w:lang w:bidi="he-IL"/>
+        </w:rPr>
+        <w:t>13</w:t>
+      </w:r>
+      <w:r>
+        <w:rPr>
+          <w:rFonts w:ascii="David" w:hAnsi="David" w:cs="David"/>
+          <w:sz w:val="24"/>
+          <w:szCs w:val="24"/>
+          <w:rtl/>
+          <w:lang w:bidi="he-IL"/>
+        </w:rPr>
+        <w:t xml:space="preserve">). המפגשים מתקיימים ביום רביעי בשעות </w:t>
+      </w:r>
+      <w:r>
+        <w:rPr>
+          <w:rFonts w:ascii="David" w:hAnsi="David" w:cs="David"/>
+          <w:sz w:val="24"/>
+          <w:szCs w:val="24"/>
+          <w:lang w:bidi="he-IL"/>
+        </w:rPr>
+        <w:t>18:30</w:t>
+      </w:r>
+      <w:r>
+        <w:rPr>
+          <w:rFonts w:ascii="David" w:hAnsi="David" w:cs="David"/>
+          <w:sz w:val="24"/>
+          <w:szCs w:val="24"/>
+          <w:rtl/>
+          <w:lang w:bidi="he-IL"/>
+        </w:rPr>
+        <w:t>–</w:t>
+      </w:r>
+      <w:r>
+        <w:rPr>
+          <w:rFonts w:ascii="David" w:hAnsi="David" w:cs="David"/>
+          <w:sz w:val="24"/>
+          <w:szCs w:val="24"/>
+          <w:lang w:bidi="he-IL"/>
+        </w:rPr>
+        <w:t>17:00</w:t>
+      </w:r>
+      <w:r>
+        <w:rPr>
+          <w:rFonts w:ascii="David" w:hAnsi="David" w:cs="David"/>
+          <w:sz w:val="24"/>
+          <w:szCs w:val="24"/>
+          <w:rtl/>
+          <w:lang w:bidi="he-IL"/>
+        </w:rPr>
+        <w:t>, במטבח קהילתי. מחיר חודשי: 190 ₪. מדריך/ה: תמר ניסים</w:t>
       </w:r>
       <w:r>
         <w:rPr>
@@ -2064,6 +3961,7 @@
           <w:rtl/>
           <w:lang w:bidi="he-IL"/>
         </w:rPr>
+        <w:lastRenderedPageBreak/>
         <w:t>כתיבה יוצרת לנוער</w:t>
       </w:r>
     </w:p>
@@ -2085,7 +3983,83 @@
           <w:rtl/>
           <w:lang w:bidi="he-IL"/>
         </w:rPr>
-        <w:t>חוג 'כתיבה יוצרת לנוער' מיועד לקבוצת גיל נוער (גילאי 13–17). המפגשים מתקיימים ביום שני בשעות 18:30–19:30, בספרייה. מחיר חודשי: 170 ₪. מדריך/ה: תמר ניסים</w:t>
+        <w:t xml:space="preserve">חוג 'כתיבה יוצרת לנוער' מיועד לקבוצת גיל נוער (גילאי </w:t>
+      </w:r>
+      <w:r>
+        <w:rPr>
+          <w:rFonts w:ascii="David" w:hAnsi="David" w:cs="David"/>
+          <w:sz w:val="24"/>
+          <w:szCs w:val="24"/>
+          <w:lang w:bidi="he-IL"/>
+        </w:rPr>
+        <w:t>17</w:t>
+      </w:r>
+      <w:r>
+        <w:rPr>
+          <w:rFonts w:ascii="David" w:hAnsi="David" w:cs="David"/>
+          <w:sz w:val="24"/>
+          <w:szCs w:val="24"/>
+          <w:rtl/>
+          <w:lang w:bidi="he-IL"/>
+        </w:rPr>
+        <w:t>–</w:t>
+      </w:r>
+      <w:r>
+        <w:rPr>
+          <w:rFonts w:ascii="David" w:hAnsi="David" w:cs="David"/>
+          <w:sz w:val="24"/>
+          <w:szCs w:val="24"/>
+          <w:lang w:bidi="he-IL"/>
+        </w:rPr>
+        <w:t>13</w:t>
+      </w:r>
+      <w:r>
+        <w:rPr>
+          <w:rFonts w:ascii="David" w:hAnsi="David" w:cs="David"/>
+          <w:sz w:val="24"/>
+          <w:szCs w:val="24"/>
+          <w:rtl/>
+          <w:lang w:bidi="he-IL"/>
+        </w:rPr>
+        <w:t xml:space="preserve">). המפגשים מתקיימים ביום שני בשעות </w:t>
+      </w:r>
+      <w:r>
+        <w:rPr>
+          <w:rFonts w:ascii="David" w:hAnsi="David" w:cs="David"/>
+          <w:sz w:val="24"/>
+          <w:szCs w:val="24"/>
+          <w:lang w:bidi="he-IL"/>
+        </w:rPr>
+        <w:t>19:30</w:t>
+      </w:r>
+      <w:r>
+        <w:rPr>
+          <w:rFonts w:ascii="David" w:hAnsi="David" w:cs="David"/>
+          <w:sz w:val="24"/>
+          <w:szCs w:val="24"/>
+          <w:rtl/>
+          <w:lang w:bidi="he-IL"/>
+        </w:rPr>
+        <w:t>–</w:t>
+      </w:r>
+      <w:r>
+        <w:rPr>
+          <w:rFonts w:ascii="David" w:hAnsi="David" w:cs="David"/>
+          <w:sz w:val="24"/>
+          <w:szCs w:val="24"/>
+          <w:lang w:bidi="he-IL"/>
+        </w:rPr>
+        <w:t>18:30</w:t>
+      </w:r>
+      <w:r>
+        <w:rPr>
+          <w:rFonts w:ascii="David" w:hAnsi="David" w:cs="David"/>
+          <w:sz w:val="24"/>
+          <w:szCs w:val="24"/>
+          <w:rtl/>
+          <w:lang w:bidi="he-IL"/>
+        </w:rPr>
+        <w:t>, בספרייה. מחיר חודשי: 170 ₪. מדריך/ה: תמר ניסים</w:t>
       </w:r>
       <w:r>
         <w:rPr>
@@ -2137,7 +4111,102 @@
           <w:rtl/>
           <w:lang w:bidi="he-IL"/>
         </w:rPr>
-        <w:t>חוג 'מדעים לילדים' מיועד לקבוצת גיל ילדים (גילאי 8–11). המפגשים מתקיימים ביום שני בשעות 17:15–18:15, בכיתה 3. מחיר חודשי: 190 ₪. מדריך/ה: אמיר חדד</w:t>
+        <w:t xml:space="preserve">חוג 'מדעים לילדים' מיועד לקבוצת גיל ילדים (גילאי </w:t>
+      </w:r>
+      <w:r>
+        <w:rPr>
+          <w:rFonts w:ascii="David" w:hAnsi="David" w:cs="David"/>
+          <w:sz w:val="24"/>
+          <w:szCs w:val="24"/>
+          <w:lang w:bidi="he-IL"/>
+        </w:rPr>
+        <w:t>11</w:t>
+      </w:r>
+      <w:r>
+        <w:rPr>
+          <w:rFonts w:ascii="David" w:hAnsi="David" w:cs="David"/>
+          <w:sz w:val="24"/>
+          <w:szCs w:val="24"/>
+          <w:rtl/>
+          <w:lang w:bidi="he-IL"/>
+        </w:rPr>
+        <w:t>–</w:t>
+      </w:r>
+      <w:r>
+        <w:rPr>
+          <w:rFonts w:ascii="David" w:hAnsi="David" w:cs="David"/>
+          <w:sz w:val="24"/>
+          <w:szCs w:val="24"/>
+          <w:lang w:bidi="he-IL"/>
+        </w:rPr>
+        <w:t>8</w:t>
+      </w:r>
+      <w:r>
+        <w:rPr>
+          <w:rFonts w:ascii="David" w:hAnsi="David" w:cs="David"/>
+          <w:sz w:val="24"/>
+          <w:szCs w:val="24"/>
+          <w:rtl/>
+          <w:lang w:bidi="he-IL"/>
+        </w:rPr>
+        <w:t>). המפגשים מתקיימים ביום שני בשעות</w:t>
+      </w:r>
+      <w:r>
+        <w:rPr>
+          <w:rFonts w:ascii="David" w:hAnsi="David" w:cs="David"/>
+          <w:sz w:val="24"/>
+          <w:szCs w:val="24"/>
+          <w:lang w:bidi="he-IL"/>
+        </w:rPr>
+        <w:t xml:space="preserve">      </w:t>
+      </w:r>
+      <w:r>
+        <w:rPr>
+          <w:rFonts w:ascii="David" w:hAnsi="David" w:cs="David"/>
+          <w:sz w:val="24"/>
+          <w:szCs w:val="24"/>
+          <w:rtl/>
+          <w:lang w:bidi="he-IL"/>
+        </w:rPr>
+        <w:t xml:space="preserve"> </w:t>
+      </w:r>
+      <w:r>
+        <w:rPr>
+          <w:rFonts w:ascii="David" w:hAnsi="David" w:cs="David"/>
+          <w:sz w:val="24"/>
+          <w:szCs w:val="24"/>
+          <w:lang w:bidi="he-IL"/>
+        </w:rPr>
+        <w:t>18:15</w:t>
+      </w:r>
+      <w:r>
+        <w:rPr>
+          <w:rFonts w:ascii="David" w:hAnsi="David" w:cs="David"/>
+          <w:sz w:val="24"/>
+          <w:szCs w:val="24"/>
+          <w:rtl/>
+          <w:lang w:bidi="he-IL"/>
+        </w:rPr>
+        <w:t>–</w:t>
+      </w:r>
+      <w:r>
+        <w:rPr>
+          <w:rFonts w:ascii="David" w:hAnsi="David" w:cs="David"/>
+          <w:sz w:val="24"/>
+          <w:szCs w:val="24"/>
+          <w:lang w:bidi="he-IL"/>
+        </w:rPr>
+        <w:t>17:15</w:t>
+      </w:r>
+      <w:r>
+        <w:rPr>
+          <w:rFonts w:ascii="David" w:hAnsi="David" w:cs="David"/>
+          <w:sz w:val="24"/>
+          <w:szCs w:val="24"/>
+          <w:rtl/>
+          <w:lang w:bidi="he-IL"/>
+        </w:rPr>
+        <w:t>, בכיתה 3. מחיר חודשי: 190 ₪. מדריך/ה: אמיר חדד</w:t>
       </w:r>
       <w:r>
         <w:rPr>
@@ -2189,7 +4258,102 @@
           <w:rtl/>
           <w:lang w:bidi="he-IL"/>
         </w:rPr>
-        <w:t>חוג 'שחמט לילדים' מיועד לקבוצת גיל ילדים (גילאי 7–12). המפגשים מתקיימים ביום רביעי בשעות 16:30–17:30, בכיתה 1. מחיר חודשי: 170 ₪. מדריך/ה: אמיר חדד</w:t>
+        <w:t xml:space="preserve">חוג 'שחמט לילדים' מיועד לקבוצת גיל ילדים (גילאי </w:t>
+      </w:r>
+      <w:r>
+        <w:rPr>
+          <w:rFonts w:ascii="David" w:hAnsi="David" w:cs="David"/>
+          <w:sz w:val="24"/>
+          <w:szCs w:val="24"/>
+          <w:lang w:bidi="he-IL"/>
+        </w:rPr>
+        <w:t>12</w:t>
+      </w:r>
+      <w:r>
+        <w:rPr>
+          <w:rFonts w:ascii="David" w:hAnsi="David" w:cs="David"/>
+          <w:sz w:val="24"/>
+          <w:szCs w:val="24"/>
+          <w:rtl/>
+          <w:lang w:bidi="he-IL"/>
+        </w:rPr>
+        <w:t>–</w:t>
+      </w:r>
+      <w:r>
+        <w:rPr>
+          <w:rFonts w:ascii="David" w:hAnsi="David" w:cs="David"/>
+          <w:sz w:val="24"/>
+          <w:szCs w:val="24"/>
+          <w:lang w:bidi="he-IL"/>
+        </w:rPr>
+        <w:t>7</w:t>
+      </w:r>
+      <w:r>
+        <w:rPr>
+          <w:rFonts w:ascii="David" w:hAnsi="David" w:cs="David"/>
+          <w:sz w:val="24"/>
+          <w:szCs w:val="24"/>
+          <w:rtl/>
+          <w:lang w:bidi="he-IL"/>
+        </w:rPr>
+        <w:t>). המפגשים מתקיימים ביום רביעי בשעות</w:t>
+      </w:r>
+      <w:r>
+        <w:rPr>
+          <w:rFonts w:ascii="David" w:hAnsi="David" w:cs="David"/>
+          <w:sz w:val="24"/>
+          <w:szCs w:val="24"/>
+          <w:lang w:bidi="he-IL"/>
+        </w:rPr>
+        <w:t xml:space="preserve">   </w:t>
+      </w:r>
+      <w:r>
+        <w:rPr>
+          <w:rFonts w:ascii="David" w:hAnsi="David" w:cs="David"/>
+          <w:sz w:val="24"/>
+          <w:szCs w:val="24"/>
+          <w:rtl/>
+          <w:lang w:bidi="he-IL"/>
+        </w:rPr>
+        <w:t xml:space="preserve"> </w:t>
+      </w:r>
+      <w:r>
+        <w:rPr>
+          <w:rFonts w:ascii="David" w:hAnsi="David" w:cs="David"/>
+          <w:sz w:val="24"/>
+          <w:szCs w:val="24"/>
+          <w:lang w:bidi="he-IL"/>
+        </w:rPr>
+        <w:t>17:30</w:t>
+      </w:r>
+      <w:r>
+        <w:rPr>
+          <w:rFonts w:ascii="David" w:hAnsi="David" w:cs="David"/>
+          <w:sz w:val="24"/>
+          <w:szCs w:val="24"/>
+          <w:rtl/>
+          <w:lang w:bidi="he-IL"/>
+        </w:rPr>
+        <w:t>–</w:t>
+      </w:r>
+      <w:r>
+        <w:rPr>
+          <w:rFonts w:ascii="David" w:hAnsi="David" w:cs="David"/>
+          <w:sz w:val="24"/>
+          <w:szCs w:val="24"/>
+          <w:lang w:bidi="he-IL"/>
+        </w:rPr>
+        <w:t>16:30</w:t>
+      </w:r>
+      <w:r>
+        <w:rPr>
+          <w:rFonts w:ascii="David" w:hAnsi="David" w:cs="David"/>
+          <w:sz w:val="24"/>
+          <w:szCs w:val="24"/>
+          <w:rtl/>
+          <w:lang w:bidi="he-IL"/>
+        </w:rPr>
+        <w:t>, בכיתה 1. מחיר חודשי: 170 ₪. מדריך/ה: אמיר חדד</w:t>
       </w:r>
       <w:r>
         <w:rPr>
@@ -2295,7 +4459,102 @@
           <w:rtl/>
           <w:lang w:bidi="he-IL"/>
         </w:rPr>
-        <w:t>חוג 'אנגלית לנוער' מיועד לקבוצת גיל נוער (גילאי 12–16). המפגשים מתקיימים ביום שני בשעות 17:00–18:00, בכיתה 2. מחיר חודשי: 220 ₪. מדריך/ה: נעמה ברק</w:t>
+        <w:t xml:space="preserve">חוג 'אנגלית לנוער' מיועד לקבוצת גיל נוער (גילאי </w:t>
+      </w:r>
+      <w:r>
+        <w:rPr>
+          <w:rFonts w:ascii="David" w:hAnsi="David" w:cs="David"/>
+          <w:sz w:val="24"/>
+          <w:szCs w:val="24"/>
+          <w:lang w:bidi="he-IL"/>
+        </w:rPr>
+        <w:t>16</w:t>
+      </w:r>
+      <w:r>
+        <w:rPr>
+          <w:rFonts w:ascii="David" w:hAnsi="David" w:cs="David"/>
+          <w:sz w:val="24"/>
+          <w:szCs w:val="24"/>
+          <w:rtl/>
+          <w:lang w:bidi="he-IL"/>
+        </w:rPr>
+        <w:t>–</w:t>
+      </w:r>
+      <w:r>
+        <w:rPr>
+          <w:rFonts w:ascii="David" w:hAnsi="David" w:cs="David"/>
+          <w:sz w:val="24"/>
+          <w:szCs w:val="24"/>
+          <w:lang w:bidi="he-IL"/>
+        </w:rPr>
+        <w:t>12</w:t>
+      </w:r>
+      <w:r>
+        <w:rPr>
+          <w:rFonts w:ascii="David" w:hAnsi="David" w:cs="David"/>
+          <w:sz w:val="24"/>
+          <w:szCs w:val="24"/>
+          <w:rtl/>
+          <w:lang w:bidi="he-IL"/>
+        </w:rPr>
+        <w:t>). המפגשים מתקיימים ביום שני בשעות</w:t>
+      </w:r>
+      <w:r>
+        <w:rPr>
+          <w:rFonts w:ascii="David" w:hAnsi="David" w:cs="David"/>
+          <w:sz w:val="24"/>
+          <w:szCs w:val="24"/>
+          <w:lang w:bidi="he-IL"/>
+        </w:rPr>
+        <w:t xml:space="preserve">         </w:t>
+      </w:r>
+      <w:r>
+        <w:rPr>
+          <w:rFonts w:ascii="David" w:hAnsi="David" w:cs="David"/>
+          <w:sz w:val="24"/>
+          <w:szCs w:val="24"/>
+          <w:rtl/>
+          <w:lang w:bidi="he-IL"/>
+        </w:rPr>
+        <w:t xml:space="preserve"> </w:t>
+      </w:r>
+      <w:r>
+        <w:rPr>
+          <w:rFonts w:ascii="David" w:hAnsi="David" w:cs="David"/>
+          <w:sz w:val="24"/>
+          <w:szCs w:val="24"/>
+          <w:lang w:bidi="he-IL"/>
+        </w:rPr>
+        <w:t>18:00</w:t>
+      </w:r>
+      <w:r>
+        <w:rPr>
+          <w:rFonts w:ascii="David" w:hAnsi="David" w:cs="David"/>
+          <w:sz w:val="24"/>
+          <w:szCs w:val="24"/>
+          <w:rtl/>
+          <w:lang w:bidi="he-IL"/>
+        </w:rPr>
+        <w:t>–</w:t>
+      </w:r>
+      <w:r>
+        <w:rPr>
+          <w:rFonts w:ascii="David" w:hAnsi="David" w:cs="David"/>
+          <w:sz w:val="24"/>
+          <w:szCs w:val="24"/>
+          <w:lang w:bidi="he-IL"/>
+        </w:rPr>
+        <w:t>17:00</w:t>
+      </w:r>
+      <w:r>
+        <w:rPr>
+          <w:rFonts w:ascii="David" w:hAnsi="David" w:cs="David"/>
+          <w:sz w:val="24"/>
+          <w:szCs w:val="24"/>
+          <w:rtl/>
+          <w:lang w:bidi="he-IL"/>
+        </w:rPr>
+        <w:t>, בכיתה 2. מחיר חודשי: 220 ₪. מדריך/ה: נעמה ברק</w:t>
       </w:r>
       <w:r>
         <w:rPr>
@@ -2347,7 +4606,83 @@
           <w:rtl/>
           <w:lang w:bidi="he-IL"/>
         </w:rPr>
-        <w:t>חוג 'ספרדית למתחילים' מיועד לקבוצת גיל מבוגרים (גילאי 18–70). המפגשים מתקיימים ביום שלישי בשעות 19:00–20:00, בכיתה 1. מחיר חודשי: 210 ₪. מדריך/ה: נעמה ברק</w:t>
+        <w:t xml:space="preserve">חוג 'ספרדית למתחילים' מיועד לקבוצת גיל מבוגרים (גילאי </w:t>
+      </w:r>
+      <w:r>
+        <w:rPr>
+          <w:rFonts w:ascii="David" w:hAnsi="David" w:cs="David"/>
+          <w:sz w:val="24"/>
+          <w:szCs w:val="24"/>
+          <w:lang w:bidi="he-IL"/>
+        </w:rPr>
+        <w:t>70</w:t>
+      </w:r>
+      <w:r>
+        <w:rPr>
+          <w:rFonts w:ascii="David" w:hAnsi="David" w:cs="David"/>
+          <w:sz w:val="24"/>
+          <w:szCs w:val="24"/>
+          <w:rtl/>
+          <w:lang w:bidi="he-IL"/>
+        </w:rPr>
+        <w:t>–</w:t>
+      </w:r>
+      <w:r>
+        <w:rPr>
+          <w:rFonts w:ascii="David" w:hAnsi="David" w:cs="David"/>
+          <w:sz w:val="24"/>
+          <w:szCs w:val="24"/>
+          <w:lang w:bidi="he-IL"/>
+        </w:rPr>
+        <w:t>18</w:t>
+      </w:r>
+      <w:r>
+        <w:rPr>
+          <w:rFonts w:ascii="David" w:hAnsi="David" w:cs="David"/>
+          <w:sz w:val="24"/>
+          <w:szCs w:val="24"/>
+          <w:rtl/>
+          <w:lang w:bidi="he-IL"/>
+        </w:rPr>
+        <w:t xml:space="preserve">). המפגשים מתקיימים ביום שלישי בשעות </w:t>
+      </w:r>
+      <w:r>
+        <w:rPr>
+          <w:rFonts w:ascii="David" w:hAnsi="David" w:cs="David"/>
+          <w:sz w:val="24"/>
+          <w:szCs w:val="24"/>
+          <w:lang w:bidi="he-IL"/>
+        </w:rPr>
+        <w:t>20:00</w:t>
+      </w:r>
+      <w:r>
+        <w:rPr>
+          <w:rFonts w:ascii="David" w:hAnsi="David" w:cs="David"/>
+          <w:sz w:val="24"/>
+          <w:szCs w:val="24"/>
+          <w:rtl/>
+          <w:lang w:bidi="he-IL"/>
+        </w:rPr>
+        <w:t>–</w:t>
+      </w:r>
+      <w:r>
+        <w:rPr>
+          <w:rFonts w:ascii="David" w:hAnsi="David" w:cs="David"/>
+          <w:sz w:val="24"/>
+          <w:szCs w:val="24"/>
+          <w:lang w:bidi="he-IL"/>
+        </w:rPr>
+        <w:t>19:00</w:t>
+      </w:r>
+      <w:r>
+        <w:rPr>
+          <w:rFonts w:ascii="David" w:hAnsi="David" w:cs="David"/>
+          <w:sz w:val="24"/>
+          <w:szCs w:val="24"/>
+          <w:rtl/>
+          <w:lang w:bidi="he-IL"/>
+        </w:rPr>
+        <w:t>, בכיתה 1. מחיר חודשי: 210 ₪. מדריך/ה: נעמה ברק</w:t>
       </w:r>
       <w:r>
         <w:rPr>
@@ -2399,7 +4734,83 @@
           <w:rtl/>
           <w:lang w:bidi="he-IL"/>
         </w:rPr>
-        <w:t>חוג 'עברית לעולים חדשים' מיועד לקבוצת גיל מבוגרים (גילאי 18–70). המפגשים מתקיימים ביום ראשון בשעות 18:00–19:30, בכיתה 3. מחיר חודשי: 100 ₪. מדריך/ה: נעמה ברק</w:t>
+        <w:t xml:space="preserve">חוג 'עברית לעולים חדשים' מיועד לקבוצת גיל מבוגרים (גילאי </w:t>
+      </w:r>
+      <w:r>
+        <w:rPr>
+          <w:rFonts w:ascii="David" w:hAnsi="David" w:cs="David"/>
+          <w:sz w:val="24"/>
+          <w:szCs w:val="24"/>
+          <w:lang w:bidi="he-IL"/>
+        </w:rPr>
+        <w:t>70</w:t>
+      </w:r>
+      <w:r>
+        <w:rPr>
+          <w:rFonts w:ascii="David" w:hAnsi="David" w:cs="David"/>
+          <w:sz w:val="24"/>
+          <w:szCs w:val="24"/>
+          <w:rtl/>
+          <w:lang w:bidi="he-IL"/>
+        </w:rPr>
+        <w:t>–</w:t>
+      </w:r>
+      <w:r>
+        <w:rPr>
+          <w:rFonts w:ascii="David" w:hAnsi="David" w:cs="David"/>
+          <w:sz w:val="24"/>
+          <w:szCs w:val="24"/>
+          <w:lang w:bidi="he-IL"/>
+        </w:rPr>
+        <w:t>18</w:t>
+      </w:r>
+      <w:r>
+        <w:rPr>
+          <w:rFonts w:ascii="David" w:hAnsi="David" w:cs="David"/>
+          <w:sz w:val="24"/>
+          <w:szCs w:val="24"/>
+          <w:rtl/>
+          <w:lang w:bidi="he-IL"/>
+        </w:rPr>
+        <w:t xml:space="preserve">). המפגשים מתקיימים ביום ראשון בשעות </w:t>
+      </w:r>
+      <w:r>
+        <w:rPr>
+          <w:rFonts w:ascii="David" w:hAnsi="David" w:cs="David"/>
+          <w:sz w:val="24"/>
+          <w:szCs w:val="24"/>
+          <w:lang w:bidi="he-IL"/>
+        </w:rPr>
+        <w:t>19:30</w:t>
+      </w:r>
+      <w:r>
+        <w:rPr>
+          <w:rFonts w:ascii="David" w:hAnsi="David" w:cs="David"/>
+          <w:sz w:val="24"/>
+          <w:szCs w:val="24"/>
+          <w:rtl/>
+          <w:lang w:bidi="he-IL"/>
+        </w:rPr>
+        <w:t>–</w:t>
+      </w:r>
+      <w:r>
+        <w:rPr>
+          <w:rFonts w:ascii="David" w:hAnsi="David" w:cs="David"/>
+          <w:sz w:val="24"/>
+          <w:szCs w:val="24"/>
+          <w:lang w:bidi="he-IL"/>
+        </w:rPr>
+        <w:t>18:00</w:t>
+      </w:r>
+      <w:r>
+        <w:rPr>
+          <w:rFonts w:ascii="David" w:hAnsi="David" w:cs="David"/>
+          <w:sz w:val="24"/>
+          <w:szCs w:val="24"/>
+          <w:rtl/>
+          <w:lang w:bidi="he-IL"/>
+        </w:rPr>
+        <w:t>, בכיתה 3. מחיר חודשי: 100 ₪. מדריך/ה: נעמה ברק</w:t>
       </w:r>
       <w:r>
         <w:rPr>
@@ -2429,6 +4840,30 @@
         </w:rPr>
         <w:t> </w:t>
       </w:r>
+    </w:p>
+    <w:p>
+      <w:pPr>
+        <w:bidi/>
+        <w:spacing w:afterLines="120" w:after="288" w:line="360" w:lineRule="auto"/>
+        <w:rPr>
+          <w:rFonts w:ascii="David" w:hAnsi="David" w:cs="David"/>
+          <w:sz w:val="24"/>
+          <w:szCs w:val="24"/>
+          <w:rtl/>
+        </w:rPr>
+      </w:pPr>
+    </w:p>
+    <w:p>
+      <w:pPr>
+        <w:bidi/>
+        <w:spacing w:afterLines="120" w:after="288" w:line="360" w:lineRule="auto"/>
+        <w:rPr>
+          <w:rFonts w:ascii="David" w:hAnsi="David" w:cs="David"/>
+          <w:sz w:val="24"/>
+          <w:szCs w:val="24"/>
+          <w:rtl/>
+        </w:rPr>
+      </w:pPr>
     </w:p>
     <w:p>
       <w:pPr>
@@ -2486,6 +4921,7 @@
           <w:rtl/>
           <w:lang w:bidi="he-IL"/>
         </w:rPr>
+        <w:lastRenderedPageBreak/>
         <w:t>צוות המדריכים</w:t>
       </w:r>
     </w:p>
@@ -2913,6 +5349,7 @@
           <w:rFonts w:ascii="David" w:hAnsi="David" w:cs="David"/>
           <w:sz w:val="24"/>
           <w:szCs w:val="24"/>
+          <w:rtl/>
         </w:rPr>
       </w:pPr>
       <w:r>
@@ -2933,6 +5370,17 @@
         </w:rPr>
         <w:t>.</w:t>
       </w:r>
+    </w:p>
+    <w:p>
+      <w:pPr>
+        <w:bidi/>
+        <w:spacing w:afterLines="120" w:after="288" w:line="360" w:lineRule="auto"/>
+        <w:rPr>
+          <w:rFonts w:ascii="David" w:hAnsi="David" w:cs="David"/>
+          <w:sz w:val="24"/>
+          <w:szCs w:val="24"/>
+        </w:rPr>
+      </w:pPr>
     </w:p>
     <w:p>
       <w:pPr>
@@ -2955,6 +5403,7 @@
           <w:rtl/>
           <w:lang w:bidi="he-IL"/>
         </w:rPr>
+        <w:lastRenderedPageBreak/>
         <w:t>שאלות נפוצות</w:t>
       </w:r>
     </w:p>
@@ -3596,6 +6045,7 @@
           <w:rtl/>
           <w:lang w:bidi="he-IL"/>
         </w:rPr>
+        <w:lastRenderedPageBreak/>
         <w:t>יריד חוגים קהילתי</w:t>
       </w:r>
     </w:p>
@@ -3956,6 +6406,7 @@
           <w:rtl/>
           <w:lang w:bidi="he-IL"/>
         </w:rPr>
+        <w:lastRenderedPageBreak/>
         <w:t>הזדמנויות התנדבות</w:t>
       </w:r>
     </w:p>
@@ -4029,7 +6480,47 @@
           <w:rtl/>
           <w:lang w:bidi="he-IL"/>
         </w:rPr>
-        <w:t>הזדמנות 'סידור ספרייה קהילתית' מתקיימת ביום חמישי בשעות 16:00–18:00, בספרייה. גיל מינימלי למתנדב: 14. איש קשר בצוות: תמר ניסים</w:t>
+        <w:t xml:space="preserve">הזדמנות 'סידור ספרייה קהילתית' מתקיימת ביום חמישי בשעות </w:t>
+      </w:r>
+      <w:r>
+        <w:rPr>
+          <w:rFonts w:ascii="David" w:hAnsi="David" w:hint="cs"/>
+          <w:sz w:val="24"/>
+          <w:szCs w:val="24"/>
+          <w:rtl/>
+          <w:lang w:bidi="ar-EG"/>
+        </w:rPr>
+        <w:t>18:00</w:t>
+      </w:r>
+      <w:r>
+        <w:rPr>
+          <w:rFonts w:ascii="David" w:hAnsi="David" w:cs="David"/>
+          <w:sz w:val="24"/>
+          <w:szCs w:val="24"/>
+          <w:rtl/>
+          <w:lang w:bidi="he-IL"/>
+        </w:rPr>
+        <w:t>–</w:t>
+      </w:r>
+      <w:r>
+        <w:rPr>
+          <w:rFonts w:ascii="David" w:hAnsi="David" w:hint="cs"/>
+          <w:sz w:val="24"/>
+          <w:szCs w:val="24"/>
+          <w:rtl/>
+          <w:lang w:bidi="ar-EG"/>
+        </w:rPr>
+        <w:t>16:00</w:t>
+      </w:r>
+      <w:r>
+        <w:rPr>
+          <w:rFonts w:ascii="David" w:hAnsi="David" w:cs="David"/>
+          <w:sz w:val="24"/>
+          <w:szCs w:val="24"/>
+          <w:rtl/>
+          <w:lang w:bidi="he-IL"/>
+        </w:rPr>
+        <w:t>, בספרייה. גיל מינימלי למתנדב: 14. איש קשר בצוות: תמר ניסים</w:t>
       </w:r>
       <w:r>
         <w:rPr>
@@ -4081,7 +6572,47 @@
           <w:rtl/>
           <w:lang w:bidi="he-IL"/>
         </w:rPr>
-        <w:t>הזדמנות 'צילום ותיעוד פעילויות' מתקיימת ביום חמישי בשעות 18:00–20:00, ברחבת המתנ״ס. גיל מינימלי למתנדב: 16. איש קשר בצוות: דניאל פרץ</w:t>
+        <w:t xml:space="preserve">הזדמנות 'צילום ותיעוד פעילויות' מתקיימת ביום חמישי בשעות </w:t>
+      </w:r>
+      <w:r>
+        <w:rPr>
+          <w:rFonts w:ascii="David" w:hAnsi="David" w:hint="cs"/>
+          <w:sz w:val="24"/>
+          <w:szCs w:val="24"/>
+          <w:rtl/>
+          <w:lang w:bidi="ar-EG"/>
+        </w:rPr>
+        <w:t>20:00</w:t>
+      </w:r>
+      <w:r>
+        <w:rPr>
+          <w:rFonts w:ascii="David" w:hAnsi="David" w:cs="David"/>
+          <w:sz w:val="24"/>
+          <w:szCs w:val="24"/>
+          <w:rtl/>
+          <w:lang w:bidi="he-IL"/>
+        </w:rPr>
+        <w:t>–</w:t>
+      </w:r>
+      <w:r>
+        <w:rPr>
+          <w:rFonts w:ascii="David" w:hAnsi="David" w:hint="cs"/>
+          <w:sz w:val="24"/>
+          <w:szCs w:val="24"/>
+          <w:rtl/>
+          <w:lang w:bidi="ar-EG"/>
+        </w:rPr>
+        <w:t>18:00</w:t>
+      </w:r>
+      <w:r>
+        <w:rPr>
+          <w:rFonts w:ascii="David" w:hAnsi="David" w:cs="David"/>
+          <w:sz w:val="24"/>
+          <w:szCs w:val="24"/>
+          <w:rtl/>
+          <w:lang w:bidi="he-IL"/>
+        </w:rPr>
+        <w:t>, ברחבת המתנ״ס. גיל מינימלי למתנדב: 16. איש קשר בצוות: דניאל פרץ</w:t>
       </w:r>
       <w:r>
         <w:rPr>
@@ -4133,7 +6664,47 @@
           <w:rtl/>
           <w:lang w:bidi="he-IL"/>
         </w:rPr>
-        <w:t>הזדמנות 'סיוע בשיעורי בית לילדים' מתקיימת ביום ראשון בשעות 16:00–18:00, בספרייה. גיל מינימלי למתנדב: 16. איש קשר בצוות: תמר ניסים</w:t>
+        <w:t xml:space="preserve">הזדמנות 'סיוע בשיעורי בית לילדים' מתקיימת ביום ראשון בשעות </w:t>
+      </w:r>
+      <w:r>
+        <w:rPr>
+          <w:rFonts w:ascii="David" w:hAnsi="David" w:hint="cs"/>
+          <w:sz w:val="24"/>
+          <w:szCs w:val="24"/>
+          <w:rtl/>
+          <w:lang w:bidi="ar-EG"/>
+        </w:rPr>
+        <w:t>18:00</w:t>
+      </w:r>
+      <w:r>
+        <w:rPr>
+          <w:rFonts w:ascii="David" w:hAnsi="David" w:cs="David"/>
+          <w:sz w:val="24"/>
+          <w:szCs w:val="24"/>
+          <w:rtl/>
+          <w:lang w:bidi="he-IL"/>
+        </w:rPr>
+        <w:t>–</w:t>
+      </w:r>
+      <w:r>
+        <w:rPr>
+          <w:rFonts w:ascii="David" w:hAnsi="David" w:hint="cs"/>
+          <w:sz w:val="24"/>
+          <w:szCs w:val="24"/>
+          <w:rtl/>
+          <w:lang w:bidi="ar-EG"/>
+        </w:rPr>
+        <w:t>16:00</w:t>
+      </w:r>
+      <w:r>
+        <w:rPr>
+          <w:rFonts w:ascii="David" w:hAnsi="David" w:cs="David"/>
+          <w:sz w:val="24"/>
+          <w:szCs w:val="24"/>
+          <w:rtl/>
+          <w:lang w:bidi="he-IL"/>
+        </w:rPr>
+        <w:t>, בספרייה. גיל מינימלי למתנדב: 16. איש קשר בצוות: תמר ניסים</w:t>
       </w:r>
       <w:r>
         <w:rPr>
@@ -4185,7 +6756,47 @@
           <w:rtl/>
           <w:lang w:bidi="he-IL"/>
         </w:rPr>
-        <w:t>הזדמנות 'קבלת פנים באירועים' מתקיימת ביום ראשון בשעות 17:00–19:00, בכניסה ראשית. גיל מינימלי למתנדב: 16. איש קשר בצוות: נעמה ברק</w:t>
+        <w:t xml:space="preserve">הזדמנות 'קבלת פנים באירועים' מתקיימת ביום ראשון בשעות </w:t>
+      </w:r>
+      <w:r>
+        <w:rPr>
+          <w:rFonts w:ascii="David" w:hAnsi="David" w:hint="cs"/>
+          <w:sz w:val="24"/>
+          <w:szCs w:val="24"/>
+          <w:rtl/>
+          <w:lang w:bidi="ar-EG"/>
+        </w:rPr>
+        <w:t>19:00</w:t>
+      </w:r>
+      <w:r>
+        <w:rPr>
+          <w:rFonts w:ascii="David" w:hAnsi="David" w:cs="David"/>
+          <w:sz w:val="24"/>
+          <w:szCs w:val="24"/>
+          <w:rtl/>
+          <w:lang w:bidi="he-IL"/>
+        </w:rPr>
+        <w:t>–</w:t>
+      </w:r>
+      <w:r>
+        <w:rPr>
+          <w:rFonts w:ascii="David" w:hAnsi="David" w:hint="cs"/>
+          <w:sz w:val="24"/>
+          <w:szCs w:val="24"/>
+          <w:rtl/>
+          <w:lang w:bidi="ar-EG"/>
+        </w:rPr>
+        <w:t>17:00</w:t>
+      </w:r>
+      <w:r>
+        <w:rPr>
+          <w:rFonts w:ascii="David" w:hAnsi="David" w:cs="David"/>
+          <w:sz w:val="24"/>
+          <w:szCs w:val="24"/>
+          <w:rtl/>
+          <w:lang w:bidi="he-IL"/>
+        </w:rPr>
+        <w:t>, בכניסה ראשית. גיל מינימלי למתנדב: 16. איש קשר בצוות: נעמה ברק</w:t>
       </w:r>
       <w:r>
         <w:rPr>
@@ -4237,7 +6848,47 @@
           <w:rtl/>
           <w:lang w:bidi="he-IL"/>
         </w:rPr>
-        <w:t>הזדמנות 'הדרכה בסיסית במחשבים' מתקיימת ביום רביעי בשעות 10:00–12:00, במעבדת מחשבים. גיל מינימלי למתנדב: 18. איש קשר בצוות: אמיר חדד</w:t>
+        <w:t xml:space="preserve">הזדמנות 'הדרכה בסיסית במחשבים' מתקיימת ביום רביעי בשעות </w:t>
+      </w:r>
+      <w:r>
+        <w:rPr>
+          <w:rFonts w:ascii="David" w:hAnsi="David" w:hint="cs"/>
+          <w:sz w:val="24"/>
+          <w:szCs w:val="24"/>
+          <w:rtl/>
+          <w:lang w:bidi="ar-EG"/>
+        </w:rPr>
+        <w:t>12:00</w:t>
+      </w:r>
+      <w:r>
+        <w:rPr>
+          <w:rFonts w:ascii="David" w:hAnsi="David" w:cs="David"/>
+          <w:sz w:val="24"/>
+          <w:szCs w:val="24"/>
+          <w:rtl/>
+          <w:lang w:bidi="he-IL"/>
+        </w:rPr>
+        <w:t>–</w:t>
+      </w:r>
+      <w:r>
+        <w:rPr>
+          <w:rFonts w:ascii="David" w:hAnsi="David" w:hint="cs"/>
+          <w:sz w:val="24"/>
+          <w:szCs w:val="24"/>
+          <w:rtl/>
+          <w:lang w:bidi="ar-EG"/>
+        </w:rPr>
+        <w:t>10:00</w:t>
+      </w:r>
+      <w:r>
+        <w:rPr>
+          <w:rFonts w:ascii="David" w:hAnsi="David" w:cs="David"/>
+          <w:sz w:val="24"/>
+          <w:szCs w:val="24"/>
+          <w:rtl/>
+          <w:lang w:bidi="he-IL"/>
+        </w:rPr>
+        <w:t>, במעבדת מחשבים. גיל מינימלי למתנדב: 18. איש קשר בצוות: אמיר חדד</w:t>
       </w:r>
       <w:r>
         <w:rPr>
@@ -4289,7 +6940,47 @@
           <w:rtl/>
           <w:lang w:bidi="he-IL"/>
         </w:rPr>
-        <w:t>הזדמנות 'עזרה באירועים קהילתיים' מתקיימת ביום שלישי בשעות 17:00–20:00, באולם מופעים. גיל מינימלי למתנדב: 16. איש קשר בצוות: מיכל לוי</w:t>
+        <w:t xml:space="preserve">הזדמנות 'עזרה באירועים קהילתיים' מתקיימת ביום שלישי בשעות </w:t>
+      </w:r>
+      <w:r>
+        <w:rPr>
+          <w:rFonts w:ascii="David" w:hAnsi="David" w:hint="cs"/>
+          <w:sz w:val="24"/>
+          <w:szCs w:val="24"/>
+          <w:rtl/>
+          <w:lang w:bidi="ar-EG"/>
+        </w:rPr>
+        <w:t>20:00</w:t>
+      </w:r>
+      <w:r>
+        <w:rPr>
+          <w:rFonts w:ascii="David" w:hAnsi="David" w:cs="David"/>
+          <w:sz w:val="24"/>
+          <w:szCs w:val="24"/>
+          <w:rtl/>
+          <w:lang w:bidi="he-IL"/>
+        </w:rPr>
+        <w:t>–</w:t>
+      </w:r>
+      <w:r>
+        <w:rPr>
+          <w:rFonts w:ascii="David" w:hAnsi="David" w:hint="cs"/>
+          <w:sz w:val="24"/>
+          <w:szCs w:val="24"/>
+          <w:rtl/>
+          <w:lang w:bidi="ar-EG"/>
+        </w:rPr>
+        <w:t>17:00</w:t>
+      </w:r>
+      <w:r>
+        <w:rPr>
+          <w:rFonts w:ascii="David" w:hAnsi="David" w:cs="David"/>
+          <w:sz w:val="24"/>
+          <w:szCs w:val="24"/>
+          <w:rtl/>
+          <w:lang w:bidi="he-IL"/>
+        </w:rPr>
+        <w:t>, באולם מופעים. גיל מינימלי למתנדב: 16. איש קשר בצוות: מיכל לוי</w:t>
       </w:r>
       <w:r>
         <w:rPr>
@@ -4341,7 +7032,47 @@
           <w:rtl/>
           <w:lang w:bidi="he-IL"/>
         </w:rPr>
-        <w:t>הזדמנות 'תמיכה בחוגי ילדים' מתקיימת ביום שלישי בשעות 16:00–18:00, בחדר אומנות. גיל מינימלי למתנדב: 16. איש קשר בצוות: מיכל לוי</w:t>
+        <w:t>הזדמנות 'תמיכה בחוגי ילדים' מתקיימת ביום שלישי בשעות</w:t>
+      </w:r>
+      <w:r>
+        <w:rPr>
+          <w:rFonts w:ascii="David" w:hAnsi="David" w:hint="cs"/>
+          <w:sz w:val="24"/>
+          <w:szCs w:val="24"/>
+          <w:rtl/>
+          <w:lang w:bidi="ar-EG"/>
+        </w:rPr>
+        <w:t xml:space="preserve"> 18:00</w:t>
+      </w:r>
+      <w:r>
+        <w:rPr>
+          <w:rFonts w:ascii="David" w:hAnsi="David" w:cs="David"/>
+          <w:sz w:val="24"/>
+          <w:szCs w:val="24"/>
+          <w:rtl/>
+          <w:lang w:bidi="he-IL"/>
+        </w:rPr>
+        <w:t>–</w:t>
+      </w:r>
+      <w:r>
+        <w:rPr>
+          <w:rFonts w:ascii="David" w:hAnsi="David" w:hint="cs"/>
+          <w:sz w:val="24"/>
+          <w:szCs w:val="24"/>
+          <w:rtl/>
+          <w:lang w:bidi="ar-EG"/>
+        </w:rPr>
+        <w:t>16:00</w:t>
+      </w:r>
+      <w:r>
+        <w:rPr>
+          <w:rFonts w:ascii="David" w:hAnsi="David" w:cs="David"/>
+          <w:sz w:val="24"/>
+          <w:szCs w:val="24"/>
+          <w:rtl/>
+          <w:lang w:bidi="he-IL"/>
+        </w:rPr>
+        <w:t>, בחדר אומנות. גיל מינימלי למתנדב: 16. איש קשר בצוות: מיכל לוי</w:t>
       </w:r>
       <w:r>
         <w:rPr>
@@ -4394,7 +7125,47 @@
           <w:rtl/>
           <w:lang w:bidi="he-IL"/>
         </w:rPr>
-        <w:t>הזדמנות 'ליווי קשישים לפעילות בוקר' מתקיימת ביום שני בשעות 09:00–11:00, בכניסה ראשית. גיל מינימלי למתנדב: 18. איש קשר בצוות: רונית אברהם</w:t>
+        <w:t xml:space="preserve">הזדמנות 'ליווי קשישים לפעילות בוקר' מתקיימת ביום שני בשעות </w:t>
+      </w:r>
+      <w:r>
+        <w:rPr>
+          <w:rFonts w:ascii="David" w:hAnsi="David" w:hint="cs"/>
+          <w:sz w:val="24"/>
+          <w:szCs w:val="24"/>
+          <w:rtl/>
+          <w:lang w:bidi="ar-EG"/>
+        </w:rPr>
+        <w:t>11:00</w:t>
+      </w:r>
+      <w:r>
+        <w:rPr>
+          <w:rFonts w:ascii="David" w:hAnsi="David" w:cs="David"/>
+          <w:sz w:val="24"/>
+          <w:szCs w:val="24"/>
+          <w:rtl/>
+          <w:lang w:bidi="he-IL"/>
+        </w:rPr>
+        <w:t>–</w:t>
+      </w:r>
+      <w:r>
+        <w:rPr>
+          <w:rFonts w:ascii="David" w:hAnsi="David" w:hint="cs"/>
+          <w:sz w:val="24"/>
+          <w:szCs w:val="24"/>
+          <w:rtl/>
+          <w:lang w:bidi="ar-EG"/>
+        </w:rPr>
+        <w:t>9:0</w:t>
+      </w:r>
+      <w:r>
+        <w:rPr>
+          <w:rFonts w:ascii="David" w:hAnsi="David" w:cs="David"/>
+          <w:sz w:val="24"/>
+          <w:szCs w:val="24"/>
+          <w:rtl/>
+          <w:lang w:bidi="he-IL"/>
+        </w:rPr>
+        <w:t>0, בכניסה ראשית. גיל מינימלי למתנדב: 18. איש קשר בצוות: רונית אברהם</w:t>
       </w:r>
       <w:r>
         <w:rPr>

</xml_diff>